<commit_message>
Recolor Aya and Pilfered Power
</commit_message>
<xml_diff>
--- a/custom/DIY卡牌_游戏内Oracle_非测试卡.docx
+++ b/custom/DIY卡牌_游戏内Oracle_非测试卡.docx
@@ -17,7 +17,7 @@
     </w:p>
     <w:p>
       <w:r>
-        <w:t>已隐藏 Gigantic Spright；当前共 115 张非测试 DIY 卡。本次 wording 审校 105 张，未改动 10 张炉石泰坦卡牌。</w:t>
+        <w:t>已隐藏 Gigantic Spright；当前共 120 张非测试 DIY 卡。本次 wording 审校 110 张，未改动 10 张炉石泰坦卡牌。</w:t>
       </w:r>
     </w:p>
     <w:p>
@@ -293,7 +293,7 @@
           <w:rFonts w:ascii="Microsoft YaHei" w:hAnsi="Microsoft YaHei" w:eastAsia="Microsoft YaHei"/>
           <w:sz w:val="20"/>
         </w:rPr>
-        <w:t>每当一个或数个友方角色（你、由你操控的生物和鹏洛客，以及由你防卫的战役）受到伤害时，若本回合中已有三个或更多不同的友方角色受到过伤害，登船（此异能于突牙在你的手牌或牌库中时生效；将突牙从你的手牌或牌库放进战场。此动作不使用堆叠。）</w:t>
+        <w:t>每当一个或数个友方角色（你和你操控的永久物）受到伤害时，若本回合中已有三个或更多不同的友方角色受到过伤害，登船（此异能于突牙在你的手牌或牌库中时生效；将突牙从你的手牌或牌库放进战场。此动作不使用堆叠。）</w:t>
       </w:r>
     </w:p>
     <w:p>
@@ -5092,6 +5092,14 @@
           <w:sz w:val="20"/>
         </w:rPr>
         <w:t>• 将你牌库中一张具有最低法术力值的牌置于你手上。</w:t>
+        <w:br/>
+      </w:r>
+      <w:r>
+        <w:rPr>
+          <w:rFonts w:ascii="Microsoft YaHei" w:hAnsi="Microsoft YaHei" w:eastAsia="Microsoft YaHei"/>
+          <w:sz w:val="20"/>
+        </w:rPr>
+        <w:t>打包{2}(若你支付打包费用，则两项都选择。)</w:t>
       </w:r>
     </w:p>
     <w:p>
@@ -5549,7 +5557,7 @@
           <w:rFonts w:ascii="Microsoft YaHei" w:hAnsi="Microsoft YaHei" w:eastAsia="Microsoft YaHei"/>
           <w:sz w:val="20"/>
         </w:rPr>
-        <w:t>当你从手上施放无界空宇且它是你本回合中施放的第一个咒语时，放逐所有不由你操控的永久物。</w:t>
+        <w:t>当你从手上施放无界空宇且它是你本回合中施放的第一个咒语时，放逐所有非地永久物。</w:t>
       </w:r>
     </w:p>
     <w:p>
@@ -6321,7 +6329,7 @@
           <w:rFonts w:ascii="Microsoft YaHei" w:hAnsi="Microsoft YaHei" w:eastAsia="Microsoft YaHei"/>
           <w:sz w:val="20"/>
         </w:rPr>
-        <w:t>当你施放主厨奈瑟雷克时，如果此牌为你的行侣，则从你的牌库中搜寻至多十张地牌，并将它们放进战场。</w:t>
+        <w:t>当你施放主厨奈瑟雷克时，如果此牌为你的行侣，则从你的牌库中搜寻至多十张各具有基本地类别的地牌，并将它们放进战场。</w:t>
       </w:r>
     </w:p>
     <w:p>
@@ -7018,7 +7026,7 @@
           <w:rFonts w:ascii="Microsoft YaHei" w:hAnsi="Microsoft YaHei" w:eastAsia="Microsoft YaHei"/>
           <w:sz w:val="20"/>
         </w:rPr>
-        <w:t>+0：从你的牌库中搜寻一张基本地牌，将它横置放进战场，然后将你的牌库洗牌。</w:t>
+        <w:t>+1：从你的牌库中搜寻一张基本地牌，将它横置放进战场，然后将你的牌库洗牌。</w:t>
         <w:br/>
       </w:r>
       <w:r>
@@ -7586,7 +7594,7 @@
           <w:rFonts w:ascii="Microsoft YaHei" w:hAnsi="Microsoft YaHei" w:eastAsia="Microsoft YaHei"/>
           <w:sz w:val="20"/>
         </w:rPr>
-        <w:t>• 每当你牺牲一个珍宝衍生物时，抓一张牌。</w:t>
+        <w:t>• 每当你牺牲一个珍宝衍生物时，你可以支付{1}。若如此作，抓一张牌。</w:t>
       </w:r>
     </w:p>
     <w:p>
@@ -7779,7 +7787,7 @@
           <w:rFonts w:ascii="Microsoft YaHei" w:hAnsi="Microsoft YaHei" w:eastAsia="Microsoft YaHei"/>
           <w:sz w:val="20"/>
         </w:rPr>
-        <w:t>• 从你的牌库中搜寻总计至多X张沼泽牌和／或山脉牌，展示这些牌，将它们置于你手上，然后洗牌。X为由你操控的生物数量。</w:t>
+        <w:t>• 从你的牌库中搜寻至多X张各具有基本地类别的地牌，将它们横置放进战场，然后洗牌。X为由你操控的生物数量。</w:t>
         <w:br/>
       </w:r>
       <w:r>
@@ -7862,7 +7870,7 @@
         <w:pStyle w:val="Heading1"/>
       </w:pPr>
       <w:r>
-        <w:t>112. 亚西克瑞非体质</w:t>
+        <w:t>112. 酸喉</w:t>
       </w:r>
     </w:p>
     <w:p>
@@ -7879,7 +7887,7 @@
           <w:rFonts w:ascii="Microsoft YaHei" w:hAnsi="Microsoft YaHei" w:eastAsia="Microsoft YaHei"/>
           <w:sz w:val="20"/>
         </w:rPr>
-        <w:t>JF99 / 1</w:t>
+        <w:t>PH01 / 123</w:t>
       </w:r>
     </w:p>
     <w:p>
@@ -7896,7 +7904,7 @@
           <w:rFonts w:ascii="Microsoft YaHei" w:hAnsi="Microsoft YaHei" w:eastAsia="Microsoft YaHei"/>
           <w:sz w:val="20"/>
         </w:rPr>
-        <w:t>结界</w:t>
+        <w:t>传奇生物～野兽／亚龙</w:t>
       </w:r>
     </w:p>
     <w:p>
@@ -7913,7 +7921,7 @@
           <w:rFonts w:ascii="Microsoft YaHei" w:hAnsi="Microsoft YaHei" w:eastAsia="Microsoft YaHei"/>
           <w:sz w:val="20"/>
         </w:rPr>
-        <w:t>只要你的总生命为1或更多，你便不会输掉游戏，且你的对手不会赢得游戏。</w:t>
+        <w:t>和恐鳞拍档。</w:t>
         <w:br/>
       </w:r>
       <w:r>
@@ -7921,7 +7929,7 @@
           <w:rFonts w:ascii="Microsoft YaHei" w:hAnsi="Microsoft YaHei" w:eastAsia="Microsoft YaHei"/>
           <w:sz w:val="20"/>
         </w:rPr>
-        <w:t>只要你的每位指挥官的颜色标识均为无色，你可以于你能施放瞬间的时机，从你的牌库中展示此牌并将它放进战场。若你如此作，洗牌。每盘游戏只能如此作一次。</w:t>
+        <w:t>每当一个除酸喉和恐鳞外的生物受到伤害时，将其消灭。</w:t>
       </w:r>
     </w:p>
     <w:p>
@@ -7929,7 +7937,7 @@
         <w:pStyle w:val="Heading1"/>
       </w:pPr>
       <w:r>
-        <w:t>113. 许攸</w:t>
+        <w:t>113. 恐鳞</w:t>
       </w:r>
     </w:p>
     <w:p>
@@ -7946,7 +7954,7 @@
           <w:rFonts w:ascii="Microsoft YaHei" w:hAnsi="Microsoft YaHei" w:eastAsia="Microsoft YaHei"/>
           <w:sz w:val="20"/>
         </w:rPr>
-        <w:t>BT3K / 1</w:t>
+        <w:t>PH01 / 124</w:t>
       </w:r>
     </w:p>
     <w:p>
@@ -7963,7 +7971,7 @@
           <w:rFonts w:ascii="Microsoft YaHei" w:hAnsi="Microsoft YaHei" w:eastAsia="Microsoft YaHei"/>
           <w:sz w:val="20"/>
         </w:rPr>
-        <w:t>传奇生物～人类／参谋</w:t>
+        <w:t>传奇生物～野兽／亚龙</w:t>
       </w:r>
     </w:p>
     <w:p>
@@ -7980,7 +7988,7 @@
           <w:rFonts w:ascii="Microsoft YaHei" w:hAnsi="Microsoft YaHei" w:eastAsia="Microsoft YaHei"/>
           <w:sz w:val="20"/>
         </w:rPr>
-        <w:t>你改为从你的牌库底抓牌。你的对手可以略过其抓牌步骤，然后从你的牌库顶抓至多两张牌。</w:t>
+        <w:t>和酸喉拍档。</w:t>
         <w:br/>
       </w:r>
       <w:r>
@@ -7988,23 +7996,7 @@
           <w:rFonts w:ascii="Microsoft YaHei" w:hAnsi="Microsoft YaHei" w:eastAsia="Microsoft YaHei"/>
           <w:sz w:val="20"/>
         </w:rPr>
-        <w:t>每当你从手上施放一个瞬间或法术咒语时，于该咒语结算时，你可以改为将该牌置于你的牌库顶而非坟墓场。若你如此做，抓一张牌。每种类别至多触发一次。</w:t>
-        <w:br/>
-      </w:r>
-      <w:r>
-        <w:rPr>
-          <w:rFonts w:ascii="Microsoft YaHei" w:hAnsi="Microsoft YaHei" w:eastAsia="Microsoft YaHei"/>
-          <w:sz w:val="20"/>
-        </w:rPr>
-        <w:t>{T}：抓一张牌，然后弃两张牌并在许攸上放置一个转换指示物。</w:t>
-        <w:br/>
-      </w:r>
-      <w:r>
-        <w:rPr>
-          <w:rFonts w:ascii="Microsoft YaHei" w:hAnsi="Microsoft YaHei" w:eastAsia="Microsoft YaHei"/>
-          <w:sz w:val="20"/>
-        </w:rPr>
-        <w:t>{T}，从许攸上移去一个转换指示物：抓两张牌，然后弃一张牌。</w:t>
+        <w:t>在你的回合结束时，恐鳞对每位对手以及其操控的每个生物各造成1点伤害。</w:t>
       </w:r>
     </w:p>
     <w:p>
@@ -8012,7 +8004,7 @@
         <w:pStyle w:val="Heading1"/>
       </w:pPr>
       <w:r>
-        <w:t>114. 超世之杰曹操</w:t>
+        <w:t>114. 极限追逐者阿兰娜</w:t>
       </w:r>
     </w:p>
     <w:p>
@@ -8029,7 +8021,7 @@
           <w:rFonts w:ascii="Microsoft YaHei" w:hAnsi="Microsoft YaHei" w:eastAsia="Microsoft YaHei"/>
           <w:sz w:val="20"/>
         </w:rPr>
-        <w:t>BT3K / 2</w:t>
+        <w:t>PH01 / 125</w:t>
       </w:r>
     </w:p>
     <w:p>
@@ -8046,7 +8038,7 @@
           <w:rFonts w:ascii="Microsoft YaHei" w:hAnsi="Microsoft YaHei" w:eastAsia="Microsoft YaHei"/>
           <w:sz w:val="20"/>
         </w:rPr>
-        <w:t>传奇生物～人类／贵族</w:t>
+        <w:t>传奇生物～德鲁伊／斥候</w:t>
       </w:r>
     </w:p>
     <w:p>
@@ -8063,7 +8055,7 @@
           <w:rFonts w:ascii="Microsoft YaHei" w:hAnsi="Microsoft YaHei" w:eastAsia="Microsoft YaHei"/>
           <w:sz w:val="20"/>
         </w:rPr>
-        <w:t>如果一个由对手操控的来源将对你或超世之杰曹操造成伤害，除非该来源的操控者支付{1}，否则防止该伤害。</w:t>
+        <w:t>如果你将要承受伤害，则防止该伤害。每以此法防止一点伤害，便在极限追逐者阿兰娜上放置一个追逐指示物。</w:t>
         <w:br/>
       </w:r>
       <w:r>
@@ -8071,7 +8063,7 @@
           <w:rFonts w:ascii="Microsoft YaHei" w:hAnsi="Microsoft YaHei" w:eastAsia="Microsoft YaHei"/>
           <w:sz w:val="20"/>
         </w:rPr>
-        <w:t>每当一个由对手操控的来源对你造成伤害时，该来源的操控者选择一项——</w:t>
+        <w:t>{R}，{T}：极限追逐者阿兰娜对任意数量的目标造成共X点伤害，由你决定分配方式，X为其上的追逐指示物数量。</w:t>
         <w:br/>
       </w:r>
       <w:r>
@@ -8079,15 +8071,7 @@
           <w:rFonts w:ascii="Microsoft YaHei" w:hAnsi="Microsoft YaHei" w:eastAsia="Microsoft YaHei"/>
           <w:sz w:val="20"/>
         </w:rPr>
-        <w:t>• 选择一个由其操控的永久物。你获得该永久物的操控权。</w:t>
-        <w:br/>
-      </w:r>
-      <w:r>
-        <w:rPr>
-          <w:rFonts w:ascii="Microsoft YaHei" w:hAnsi="Microsoft YaHei" w:eastAsia="Microsoft YaHei"/>
-          <w:sz w:val="20"/>
-        </w:rPr>
-        <w:t>• 从其手牌放逐一张牌。</w:t>
+        <w:t>在每个结束步骤开始时，移去极限追逐者阿兰娜上的所有追逐指示物。</w:t>
       </w:r>
     </w:p>
     <w:p>
@@ -8095,7 +8079,374 @@
         <w:pStyle w:val="Heading1"/>
       </w:pPr>
       <w:r>
-        <w:t>115. 魏武帝曹操</w:t>
+        <w:t>115. 尘魔</w:t>
+      </w:r>
+    </w:p>
+    <w:p>
+      <w:r>
+        <w:rPr>
+          <w:rFonts w:ascii="Microsoft YaHei" w:hAnsi="Microsoft YaHei" w:eastAsia="Microsoft YaHei"/>
+          <w:b/>
+          <w:sz w:val="20"/>
+        </w:rPr>
+        <w:t>版本：</w:t>
+      </w:r>
+      <w:r>
+        <w:rPr>
+          <w:rFonts w:ascii="Microsoft YaHei" w:hAnsi="Microsoft YaHei" w:eastAsia="Microsoft YaHei"/>
+          <w:sz w:val="20"/>
+        </w:rPr>
+        <w:t>PH01 / 126</w:t>
+      </w:r>
+    </w:p>
+    <w:p>
+      <w:r>
+        <w:rPr>
+          <w:rFonts w:ascii="Microsoft YaHei" w:hAnsi="Microsoft YaHei" w:eastAsia="Microsoft YaHei"/>
+          <w:b/>
+          <w:sz w:val="20"/>
+        </w:rPr>
+        <w:t>类别：</w:t>
+      </w:r>
+      <w:r>
+        <w:rPr>
+          <w:rFonts w:ascii="Microsoft YaHei" w:hAnsi="Microsoft YaHei" w:eastAsia="Microsoft YaHei"/>
+          <w:sz w:val="20"/>
+        </w:rPr>
+        <w:t>生物～元素</w:t>
+      </w:r>
+    </w:p>
+    <w:p>
+      <w:r>
+        <w:rPr>
+          <w:rFonts w:ascii="Microsoft YaHei" w:hAnsi="Microsoft YaHei" w:eastAsia="Microsoft YaHei"/>
+          <w:b/>
+          <w:sz w:val="20"/>
+        </w:rPr>
+        <w:t>Oracle：</w:t>
+      </w:r>
+      <w:r>
+        <w:rPr>
+          <w:rFonts w:ascii="Microsoft YaHei" w:hAnsi="Microsoft YaHei" w:eastAsia="Microsoft YaHei"/>
+          <w:sz w:val="20"/>
+        </w:rPr>
+        <w:t>作为施放此咒语的额外费用，选择一个由你操控的地，其在下个重置步骤不能被重置。</w:t>
+        <w:br/>
+      </w:r>
+      <w:r>
+        <w:rPr>
+          <w:rFonts w:ascii="Microsoft YaHei" w:hAnsi="Microsoft YaHei" w:eastAsia="Microsoft YaHei"/>
+          <w:sz w:val="20"/>
+        </w:rPr>
+        <w:t>风怒（在战斗阶段结束后，具有风怒的生物共同执行一个额外的战斗阶段）</w:t>
+      </w:r>
+    </w:p>
+    <w:p>
+      <w:pPr>
+        <w:pStyle w:val="Heading1"/>
+      </w:pPr>
+      <w:r>
+        <w:t>116. 黑心票贩</w:t>
+      </w:r>
+    </w:p>
+    <w:p>
+      <w:r>
+        <w:rPr>
+          <w:rFonts w:ascii="Microsoft YaHei" w:hAnsi="Microsoft YaHei" w:eastAsia="Microsoft YaHei"/>
+          <w:b/>
+          <w:sz w:val="20"/>
+        </w:rPr>
+        <w:t>版本：</w:t>
+      </w:r>
+      <w:r>
+        <w:rPr>
+          <w:rFonts w:ascii="Microsoft YaHei" w:hAnsi="Microsoft YaHei" w:eastAsia="Microsoft YaHei"/>
+          <w:sz w:val="20"/>
+        </w:rPr>
+        <w:t>PH01 / 127</w:t>
+      </w:r>
+    </w:p>
+    <w:p>
+      <w:r>
+        <w:rPr>
+          <w:rFonts w:ascii="Microsoft YaHei" w:hAnsi="Microsoft YaHei" w:eastAsia="Microsoft YaHei"/>
+          <w:b/>
+          <w:sz w:val="20"/>
+        </w:rPr>
+        <w:t>类别：</w:t>
+      </w:r>
+      <w:r>
+        <w:rPr>
+          <w:rFonts w:ascii="Microsoft YaHei" w:hAnsi="Microsoft YaHei" w:eastAsia="Microsoft YaHei"/>
+          <w:sz w:val="20"/>
+        </w:rPr>
+        <w:t>生物～海盗</w:t>
+      </w:r>
+    </w:p>
+    <w:p>
+      <w:r>
+        <w:rPr>
+          <w:rFonts w:ascii="Microsoft YaHei" w:hAnsi="Microsoft YaHei" w:eastAsia="Microsoft YaHei"/>
+          <w:b/>
+          <w:sz w:val="20"/>
+        </w:rPr>
+        <w:t>Oracle：</w:t>
+      </w:r>
+      <w:r>
+        <w:rPr>
+          <w:rFonts w:ascii="Microsoft YaHei" w:hAnsi="Microsoft YaHei" w:eastAsia="Microsoft YaHei"/>
+          <w:sz w:val="20"/>
+        </w:rPr>
+        <w:t>只要你操控另一个海盗，黑心票贩便具有敏捷和挑拨。</w:t>
+        <w:br/>
+      </w:r>
+      <w:r>
+        <w:rPr>
+          <w:rFonts w:ascii="Microsoft YaHei" w:hAnsi="Microsoft YaHei" w:eastAsia="Microsoft YaHei"/>
+          <w:sz w:val="20"/>
+        </w:rPr>
+        <w:t>每当黑心票贩因攻击造成过量伤害时，抓两张牌。</w:t>
+      </w:r>
+    </w:p>
+    <w:p>
+      <w:pPr>
+        <w:pStyle w:val="Heading1"/>
+      </w:pPr>
+      <w:r>
+        <w:t>117. 亚西克瑞非体质</w:t>
+      </w:r>
+    </w:p>
+    <w:p>
+      <w:r>
+        <w:rPr>
+          <w:rFonts w:ascii="Microsoft YaHei" w:hAnsi="Microsoft YaHei" w:eastAsia="Microsoft YaHei"/>
+          <w:b/>
+          <w:sz w:val="20"/>
+        </w:rPr>
+        <w:t>版本：</w:t>
+      </w:r>
+      <w:r>
+        <w:rPr>
+          <w:rFonts w:ascii="Microsoft YaHei" w:hAnsi="Microsoft YaHei" w:eastAsia="Microsoft YaHei"/>
+          <w:sz w:val="20"/>
+        </w:rPr>
+        <w:t>JF99 / 1</w:t>
+      </w:r>
+    </w:p>
+    <w:p>
+      <w:r>
+        <w:rPr>
+          <w:rFonts w:ascii="Microsoft YaHei" w:hAnsi="Microsoft YaHei" w:eastAsia="Microsoft YaHei"/>
+          <w:b/>
+          <w:sz w:val="20"/>
+        </w:rPr>
+        <w:t>类别：</w:t>
+      </w:r>
+      <w:r>
+        <w:rPr>
+          <w:rFonts w:ascii="Microsoft YaHei" w:hAnsi="Microsoft YaHei" w:eastAsia="Microsoft YaHei"/>
+          <w:sz w:val="20"/>
+        </w:rPr>
+        <w:t>结界</w:t>
+      </w:r>
+    </w:p>
+    <w:p>
+      <w:r>
+        <w:rPr>
+          <w:rFonts w:ascii="Microsoft YaHei" w:hAnsi="Microsoft YaHei" w:eastAsia="Microsoft YaHei"/>
+          <w:b/>
+          <w:sz w:val="20"/>
+        </w:rPr>
+        <w:t>Oracle：</w:t>
+      </w:r>
+      <w:r>
+        <w:rPr>
+          <w:rFonts w:ascii="Microsoft YaHei" w:hAnsi="Microsoft YaHei" w:eastAsia="Microsoft YaHei"/>
+          <w:sz w:val="20"/>
+        </w:rPr>
+        <w:t>只要你的总生命为1或更多，你便不会输掉游戏，且你的对手不会赢得游戏。</w:t>
+        <w:br/>
+      </w:r>
+      <w:r>
+        <w:rPr>
+          <w:rFonts w:ascii="Microsoft YaHei" w:hAnsi="Microsoft YaHei" w:eastAsia="Microsoft YaHei"/>
+          <w:sz w:val="20"/>
+        </w:rPr>
+        <w:t>只要你的每位指挥官的颜色标识均为无色，你可以于你能施放瞬间的时机，从你的牌库中展示此牌并将它放进战场。若你如此作，洗牌。每盘游戏只能如此作一次。</w:t>
+      </w:r>
+    </w:p>
+    <w:p>
+      <w:pPr>
+        <w:pStyle w:val="Heading1"/>
+      </w:pPr>
+      <w:r>
+        <w:t>118. 许攸</w:t>
+      </w:r>
+    </w:p>
+    <w:p>
+      <w:r>
+        <w:rPr>
+          <w:rFonts w:ascii="Microsoft YaHei" w:hAnsi="Microsoft YaHei" w:eastAsia="Microsoft YaHei"/>
+          <w:b/>
+          <w:sz w:val="20"/>
+        </w:rPr>
+        <w:t>版本：</w:t>
+      </w:r>
+      <w:r>
+        <w:rPr>
+          <w:rFonts w:ascii="Microsoft YaHei" w:hAnsi="Microsoft YaHei" w:eastAsia="Microsoft YaHei"/>
+          <w:sz w:val="20"/>
+        </w:rPr>
+        <w:t>BT3K / 1</w:t>
+      </w:r>
+    </w:p>
+    <w:p>
+      <w:r>
+        <w:rPr>
+          <w:rFonts w:ascii="Microsoft YaHei" w:hAnsi="Microsoft YaHei" w:eastAsia="Microsoft YaHei"/>
+          <w:b/>
+          <w:sz w:val="20"/>
+        </w:rPr>
+        <w:t>类别：</w:t>
+      </w:r>
+      <w:r>
+        <w:rPr>
+          <w:rFonts w:ascii="Microsoft YaHei" w:hAnsi="Microsoft YaHei" w:eastAsia="Microsoft YaHei"/>
+          <w:sz w:val="20"/>
+        </w:rPr>
+        <w:t>传奇生物～人类／参谋</w:t>
+      </w:r>
+    </w:p>
+    <w:p>
+      <w:r>
+        <w:rPr>
+          <w:rFonts w:ascii="Microsoft YaHei" w:hAnsi="Microsoft YaHei" w:eastAsia="Microsoft YaHei"/>
+          <w:b/>
+          <w:sz w:val="20"/>
+        </w:rPr>
+        <w:t>Oracle：</w:t>
+      </w:r>
+      <w:r>
+        <w:rPr>
+          <w:rFonts w:ascii="Microsoft YaHei" w:hAnsi="Microsoft YaHei" w:eastAsia="Microsoft YaHei"/>
+          <w:sz w:val="20"/>
+        </w:rPr>
+        <w:t>你改为从你的牌库底抓牌。你的对手可以略过其抓牌步骤，然后从你的牌库顶抓至多两张牌。</w:t>
+        <w:br/>
+      </w:r>
+      <w:r>
+        <w:rPr>
+          <w:rFonts w:ascii="Microsoft YaHei" w:hAnsi="Microsoft YaHei" w:eastAsia="Microsoft YaHei"/>
+          <w:sz w:val="20"/>
+        </w:rPr>
+        <w:t>每当你从手上施放一个瞬间或法术咒语时，于该咒语结算时，你可以改为将该牌置于你的牌库顶而非坟墓场。若你如此做，抓一张牌。每种类别至多触发一次。</w:t>
+        <w:br/>
+      </w:r>
+      <w:r>
+        <w:rPr>
+          <w:rFonts w:ascii="Microsoft YaHei" w:hAnsi="Microsoft YaHei" w:eastAsia="Microsoft YaHei"/>
+          <w:sz w:val="20"/>
+        </w:rPr>
+        <w:t>{T}：抓一张牌，然后弃两张牌并在许攸上放置一个转换指示物。</w:t>
+        <w:br/>
+      </w:r>
+      <w:r>
+        <w:rPr>
+          <w:rFonts w:ascii="Microsoft YaHei" w:hAnsi="Microsoft YaHei" w:eastAsia="Microsoft YaHei"/>
+          <w:sz w:val="20"/>
+        </w:rPr>
+        <w:t>{T}，从许攸上移去一个转换指示物：抓两张牌，然后弃一张牌。</w:t>
+      </w:r>
+    </w:p>
+    <w:p>
+      <w:pPr>
+        <w:pStyle w:val="Heading1"/>
+      </w:pPr>
+      <w:r>
+        <w:t>119. 神曹操</w:t>
+      </w:r>
+    </w:p>
+    <w:p>
+      <w:r>
+        <w:rPr>
+          <w:rFonts w:ascii="Microsoft YaHei" w:hAnsi="Microsoft YaHei" w:eastAsia="Microsoft YaHei"/>
+          <w:b/>
+          <w:sz w:val="20"/>
+        </w:rPr>
+        <w:t>版本：</w:t>
+      </w:r>
+      <w:r>
+        <w:rPr>
+          <w:rFonts w:ascii="Microsoft YaHei" w:hAnsi="Microsoft YaHei" w:eastAsia="Microsoft YaHei"/>
+          <w:sz w:val="20"/>
+        </w:rPr>
+        <w:t>BT3K / 2</w:t>
+      </w:r>
+    </w:p>
+    <w:p>
+      <w:r>
+        <w:rPr>
+          <w:rFonts w:ascii="Microsoft YaHei" w:hAnsi="Microsoft YaHei" w:eastAsia="Microsoft YaHei"/>
+          <w:b/>
+          <w:sz w:val="20"/>
+        </w:rPr>
+        <w:t>类别：</w:t>
+      </w:r>
+      <w:r>
+        <w:rPr>
+          <w:rFonts w:ascii="Microsoft YaHei" w:hAnsi="Microsoft YaHei" w:eastAsia="Microsoft YaHei"/>
+          <w:sz w:val="20"/>
+        </w:rPr>
+        <w:t>传奇生物～人类／贵族</w:t>
+      </w:r>
+    </w:p>
+    <w:p>
+      <w:r>
+        <w:rPr>
+          <w:rFonts w:ascii="Microsoft YaHei" w:hAnsi="Microsoft YaHei" w:eastAsia="Microsoft YaHei"/>
+          <w:b/>
+          <w:sz w:val="20"/>
+        </w:rPr>
+        <w:t>Oracle：</w:t>
+      </w:r>
+      <w:r>
+        <w:rPr>
+          <w:rFonts w:ascii="Microsoft YaHei" w:hAnsi="Microsoft YaHei" w:eastAsia="Microsoft YaHei"/>
+          <w:sz w:val="20"/>
+        </w:rPr>
+        <w:t>抵受1。如果一个由对手操控的来源将对你造成伤害，除非该来源的操控者支付{1}，否则防止该伤害。</w:t>
+        <w:br/>
+      </w:r>
+      <w:r>
+        <w:rPr>
+          <w:rFonts w:ascii="Microsoft YaHei" w:hAnsi="Microsoft YaHei" w:eastAsia="Microsoft YaHei"/>
+          <w:sz w:val="20"/>
+        </w:rPr>
+        <w:t>每当一个由对手操控的来源对你造成伤害时，该来源的操控者选择一项——</w:t>
+        <w:br/>
+      </w:r>
+      <w:r>
+        <w:rPr>
+          <w:rFonts w:ascii="Microsoft YaHei" w:hAnsi="Microsoft YaHei" w:eastAsia="Microsoft YaHei"/>
+          <w:sz w:val="20"/>
+        </w:rPr>
+        <w:t>• 选择一个由其操控的永久物。你获得该永久物的操控权。</w:t>
+        <w:br/>
+      </w:r>
+      <w:r>
+        <w:rPr>
+          <w:rFonts w:ascii="Microsoft YaHei" w:hAnsi="Microsoft YaHei" w:eastAsia="Microsoft YaHei"/>
+          <w:sz w:val="20"/>
+        </w:rPr>
+        <w:t>• 从其手牌放逐一张牌。</w:t>
+      </w:r>
+    </w:p>
+    <w:p>
+      <w:pPr>
+        <w:pStyle w:val="Heading1"/>
+      </w:pPr>
+      <w:r>
+        <w:t>120. 魏武帝曹操</w:t>
       </w:r>
     </w:p>
     <w:p>

</xml_diff>

<commit_message>
Add Yu Ji and update Chef Nethrazek
</commit_message>
<xml_diff>
--- a/custom/DIY卡牌_游戏内Oracle_非测试卡.docx
+++ b/custom/DIY卡牌_游戏内Oracle_非测试卡.docx
@@ -17,7 +17,7 @@
     </w:p>
     <w:p>
       <w:r>
-        <w:t>已隐藏 Gigantic Spright；当前共 120 张非测试 DIY 卡。本次 wording 审校 110 张，未改动 10 张炉石泰坦卡牌。</w:t>
+        <w:t>已隐藏 Gigantic Spright；当前共 127 张非测试 DIY 卡。本次 wording 审校 117 张，未改动 10 张炉石泰坦卡牌。</w:t>
       </w:r>
     </w:p>
     <w:p>
@@ -6329,7 +6329,7 @@
           <w:rFonts w:ascii="Microsoft YaHei" w:hAnsi="Microsoft YaHei" w:eastAsia="Microsoft YaHei"/>
           <w:sz w:val="20"/>
         </w:rPr>
-        <w:t>当你施放主厨奈瑟雷克时，如果此牌为你的行侣，则从你的牌库中搜寻至多十张各具有基本地类别的地牌，并将它们放进战场。</w:t>
+        <w:t>当你施放主厨奈瑟雷克时，如果此牌为你的行侣，则从你的牌库顶开始展示牌，直到展示出十张各具有基本地类别的地牌为止。将这些地牌放进战场，其余则以随机顺序置于你的牌库底。</w:t>
       </w:r>
     </w:p>
     <w:p>
@@ -8213,7 +8213,7 @@
         <w:pStyle w:val="Heading1"/>
       </w:pPr>
       <w:r>
-        <w:t>117. 亚西克瑞非体质</w:t>
+        <w:t>117. 开进码头</w:t>
       </w:r>
     </w:p>
     <w:p>
@@ -8230,7 +8230,7 @@
           <w:rFonts w:ascii="Microsoft YaHei" w:hAnsi="Microsoft YaHei" w:eastAsia="Microsoft YaHei"/>
           <w:sz w:val="20"/>
         </w:rPr>
-        <w:t>JF99 / 1</w:t>
+        <w:t>PH01 / 128</w:t>
       </w:r>
     </w:p>
     <w:p>
@@ -8247,7 +8247,7 @@
           <w:rFonts w:ascii="Microsoft YaHei" w:hAnsi="Microsoft YaHei" w:eastAsia="Microsoft YaHei"/>
           <w:sz w:val="20"/>
         </w:rPr>
-        <w:t>结界</w:t>
+        <w:t>传奇结界～任务</w:t>
       </w:r>
     </w:p>
     <w:p>
@@ -8264,7 +8264,7 @@
           <w:rFonts w:ascii="Microsoft YaHei" w:hAnsi="Microsoft YaHei" w:eastAsia="Microsoft YaHei"/>
           <w:sz w:val="20"/>
         </w:rPr>
-        <w:t>只要你的总生命为1或更多，你便不会输掉游戏，且你的对手不会赢得游戏。</w:t>
+        <w:t>任务～你的起始套牌中包含海盗牌、武具牌和史迹牌。</w:t>
         <w:br/>
       </w:r>
       <w:r>
@@ -8272,7 +8272,31 @@
           <w:rFonts w:ascii="Microsoft YaHei" w:hAnsi="Microsoft YaHei" w:eastAsia="Microsoft YaHei"/>
           <w:sz w:val="20"/>
         </w:rPr>
-        <w:t>只要你的每位指挥官的颜色标识均为无色，你可以于你能施放瞬间的时机，从你的牌库中展示此牌并将它放进战场。若你如此作，洗牌。每盘游戏只能如此作一次。</w:t>
+        <w:t>初始阶段为0，使用两张海盗牌后达到下一阶段。</w:t>
+        <w:br/>
+      </w:r>
+      <w:r>
+        <w:rPr>
+          <w:rFonts w:ascii="Microsoft YaHei" w:hAnsi="Microsoft YaHei" w:eastAsia="Microsoft YaHei"/>
+          <w:sz w:val="20"/>
+        </w:rPr>
+        <w:t>阶段1～竭绝：从你的牌库中搜寻一张总法术力值等于或小于2的武具牌，将它放进战场，然后洗牌。</w:t>
+        <w:br/>
+      </w:r>
+      <w:r>
+        <w:rPr>
+          <w:rFonts w:ascii="Microsoft YaHei" w:hAnsi="Microsoft YaHei" w:eastAsia="Microsoft YaHei"/>
+          <w:sz w:val="20"/>
+        </w:rPr>
+        <w:t>阶段2～竭绝：开进码头对至多两个目标各造成2点伤害。</w:t>
+        <w:br/>
+      </w:r>
+      <w:r>
+        <w:rPr>
+          <w:rFonts w:ascii="Microsoft YaHei" w:hAnsi="Microsoft YaHei" w:eastAsia="Microsoft YaHei"/>
+          <w:sz w:val="20"/>
+        </w:rPr>
+        <w:t>阶段3～竭绝～{5}：你获得名为“毁灭战舰”的徽记。</w:t>
       </w:r>
     </w:p>
     <w:p>
@@ -8280,7 +8304,7 @@
         <w:pStyle w:val="Heading1"/>
       </w:pPr>
       <w:r>
-        <w:t>118. 许攸</w:t>
+        <w:t>118. 宝藏经销商</w:t>
       </w:r>
     </w:p>
     <w:p>
@@ -8297,7 +8321,7 @@
           <w:rFonts w:ascii="Microsoft YaHei" w:hAnsi="Microsoft YaHei" w:eastAsia="Microsoft YaHei"/>
           <w:sz w:val="20"/>
         </w:rPr>
-        <w:t>BT3K / 1</w:t>
+        <w:t>PH01 / 129</w:t>
       </w:r>
     </w:p>
     <w:p>
@@ -8314,7 +8338,7 @@
           <w:rFonts w:ascii="Microsoft YaHei" w:hAnsi="Microsoft YaHei" w:eastAsia="Microsoft YaHei"/>
           <w:sz w:val="20"/>
         </w:rPr>
-        <w:t>传奇生物～人类／参谋</w:t>
+        <w:t>生物～海盗</w:t>
       </w:r>
     </w:p>
     <w:p>
@@ -8331,31 +8355,7 @@
           <w:rFonts w:ascii="Microsoft YaHei" w:hAnsi="Microsoft YaHei" w:eastAsia="Microsoft YaHei"/>
           <w:sz w:val="20"/>
         </w:rPr>
-        <w:t>你改为从你的牌库底抓牌。你的对手可以略过其抓牌步骤，然后从你的牌库顶抓至多两张牌。</w:t>
-        <w:br/>
-      </w:r>
-      <w:r>
-        <w:rPr>
-          <w:rFonts w:ascii="Microsoft YaHei" w:hAnsi="Microsoft YaHei" w:eastAsia="Microsoft YaHei"/>
-          <w:sz w:val="20"/>
-        </w:rPr>
-        <w:t>每当你从手上施放一个瞬间或法术咒语时，于该咒语结算时，你可以改为将该牌置于你的牌库顶而非坟墓场。若你如此做，抓一张牌。每种类别至多触发一次。</w:t>
-        <w:br/>
-      </w:r>
-      <w:r>
-        <w:rPr>
-          <w:rFonts w:ascii="Microsoft YaHei" w:hAnsi="Microsoft YaHei" w:eastAsia="Microsoft YaHei"/>
-          <w:sz w:val="20"/>
-        </w:rPr>
-        <w:t>{T}：抓一张牌，然后弃两张牌并在许攸上放置一个转换指示物。</w:t>
-        <w:br/>
-      </w:r>
-      <w:r>
-        <w:rPr>
-          <w:rFonts w:ascii="Microsoft YaHei" w:hAnsi="Microsoft YaHei" w:eastAsia="Microsoft YaHei"/>
-          <w:sz w:val="20"/>
-        </w:rPr>
-        <w:t>{T}，从许攸上移去一个转换指示物：抓两张牌，然后弃一张牌。</w:t>
+        <w:t>在你召唤一个海盗后，使其永久获得+1攻击力。</w:t>
       </w:r>
     </w:p>
     <w:p>
@@ -8363,7 +8363,7 @@
         <w:pStyle w:val="Heading1"/>
       </w:pPr>
       <w:r>
-        <w:t>119. 神曹操</w:t>
+        <w:t>119. 钩手拖曳</w:t>
       </w:r>
     </w:p>
     <w:p>
@@ -8380,7 +8380,7 @@
           <w:rFonts w:ascii="Microsoft YaHei" w:hAnsi="Microsoft YaHei" w:eastAsia="Microsoft YaHei"/>
           <w:sz w:val="20"/>
         </w:rPr>
-        <w:t>BT3K / 2</w:t>
+        <w:t>PH01 / 130</w:t>
       </w:r>
     </w:p>
     <w:p>
@@ -8397,7 +8397,7 @@
           <w:rFonts w:ascii="Microsoft YaHei" w:hAnsi="Microsoft YaHei" w:eastAsia="Microsoft YaHei"/>
           <w:sz w:val="20"/>
         </w:rPr>
-        <w:t>传奇生物～人类／贵族</w:t>
+        <w:t>法术</w:t>
       </w:r>
     </w:p>
     <w:p>
@@ -8414,31 +8414,7 @@
           <w:rFonts w:ascii="Microsoft YaHei" w:hAnsi="Microsoft YaHei" w:eastAsia="Microsoft YaHei"/>
           <w:sz w:val="20"/>
         </w:rPr>
-        <w:t>抵受1。如果一个由对手操控的来源将对你造成伤害，除非该来源的操控者支付{1}，否则防止该伤害。</w:t>
-        <w:br/>
-      </w:r>
-      <w:r>
-        <w:rPr>
-          <w:rFonts w:ascii="Microsoft YaHei" w:hAnsi="Microsoft YaHei" w:eastAsia="Microsoft YaHei"/>
-          <w:sz w:val="20"/>
-        </w:rPr>
-        <w:t>每当一个由对手操控的来源对你造成伤害时，该来源的操控者选择一项——</w:t>
-        <w:br/>
-      </w:r>
-      <w:r>
-        <w:rPr>
-          <w:rFonts w:ascii="Microsoft YaHei" w:hAnsi="Microsoft YaHei" w:eastAsia="Microsoft YaHei"/>
-          <w:sz w:val="20"/>
-        </w:rPr>
-        <w:t>• 选择一个由其操控的永久物。你获得该永久物的操控权。</w:t>
-        <w:br/>
-      </w:r>
-      <w:r>
-        <w:rPr>
-          <w:rFonts w:ascii="Microsoft YaHei" w:hAnsi="Microsoft YaHei" w:eastAsia="Microsoft YaHei"/>
-          <w:sz w:val="20"/>
-        </w:rPr>
-        <w:t>• 从其手牌放逐一张牌。</w:t>
+        <w:t>抓一张牌，派出两个火炮手。</w:t>
       </w:r>
     </w:p>
     <w:p>
@@ -8446,7 +8422,433 @@
         <w:pStyle w:val="Heading1"/>
       </w:pPr>
       <w:r>
-        <w:t>120. 魏武帝曹操</w:t>
+        <w:t>120. 火炮长</w:t>
+      </w:r>
+    </w:p>
+    <w:p>
+      <w:r>
+        <w:rPr>
+          <w:rFonts w:ascii="Microsoft YaHei" w:hAnsi="Microsoft YaHei" w:eastAsia="Microsoft YaHei"/>
+          <w:b/>
+          <w:sz w:val="20"/>
+        </w:rPr>
+        <w:t>版本：</w:t>
+      </w:r>
+      <w:r>
+        <w:rPr>
+          <w:rFonts w:ascii="Microsoft YaHei" w:hAnsi="Microsoft YaHei" w:eastAsia="Microsoft YaHei"/>
+          <w:sz w:val="20"/>
+        </w:rPr>
+        <w:t>PH01 / 131</w:t>
+      </w:r>
+    </w:p>
+    <w:p>
+      <w:r>
+        <w:rPr>
+          <w:rFonts w:ascii="Microsoft YaHei" w:hAnsi="Microsoft YaHei" w:eastAsia="Microsoft YaHei"/>
+          <w:b/>
+          <w:sz w:val="20"/>
+        </w:rPr>
+        <w:t>类别：</w:t>
+      </w:r>
+      <w:r>
+        <w:rPr>
+          <w:rFonts w:ascii="Microsoft YaHei" w:hAnsi="Microsoft YaHei" w:eastAsia="Microsoft YaHei"/>
+          <w:sz w:val="20"/>
+        </w:rPr>
+        <w:t>生物～海盗</w:t>
+      </w:r>
+    </w:p>
+    <w:p>
+      <w:r>
+        <w:rPr>
+          <w:rFonts w:ascii="Microsoft YaHei" w:hAnsi="Microsoft YaHei" w:eastAsia="Microsoft YaHei"/>
+          <w:b/>
+          <w:sz w:val="20"/>
+        </w:rPr>
+        <w:t>Oracle：</w:t>
+      </w:r>
+      <w:r>
+        <w:rPr>
+          <w:rFonts w:ascii="Microsoft YaHei" w:hAnsi="Microsoft YaHei" w:eastAsia="Microsoft YaHei"/>
+          <w:sz w:val="20"/>
+        </w:rPr>
+        <w:t>当火炮长进战场时，你可以支付{R}。若如此做，派出一个火炮手。</w:t>
+      </w:r>
+    </w:p>
+    <w:p>
+      <w:pPr>
+        <w:pStyle w:val="Heading1"/>
+      </w:pPr>
+      <w:r>
+        <w:t>121. 船载火炮</w:t>
+      </w:r>
+    </w:p>
+    <w:p>
+      <w:r>
+        <w:rPr>
+          <w:rFonts w:ascii="Microsoft YaHei" w:hAnsi="Microsoft YaHei" w:eastAsia="Microsoft YaHei"/>
+          <w:b/>
+          <w:sz w:val="20"/>
+        </w:rPr>
+        <w:t>版本：</w:t>
+      </w:r>
+      <w:r>
+        <w:rPr>
+          <w:rFonts w:ascii="Microsoft YaHei" w:hAnsi="Microsoft YaHei" w:eastAsia="Microsoft YaHei"/>
+          <w:sz w:val="20"/>
+        </w:rPr>
+        <w:t>PH01 / 132</w:t>
+      </w:r>
+    </w:p>
+    <w:p>
+      <w:r>
+        <w:rPr>
+          <w:rFonts w:ascii="Microsoft YaHei" w:hAnsi="Microsoft YaHei" w:eastAsia="Microsoft YaHei"/>
+          <w:b/>
+          <w:sz w:val="20"/>
+        </w:rPr>
+        <w:t>类别：</w:t>
+      </w:r>
+      <w:r>
+        <w:rPr>
+          <w:rFonts w:ascii="Microsoft YaHei" w:hAnsi="Microsoft YaHei" w:eastAsia="Microsoft YaHei"/>
+          <w:sz w:val="20"/>
+        </w:rPr>
+        <w:t>神器生物～构装体</w:t>
+      </w:r>
+    </w:p>
+    <w:p>
+      <w:r>
+        <w:rPr>
+          <w:rFonts w:ascii="Microsoft YaHei" w:hAnsi="Microsoft YaHei" w:eastAsia="Microsoft YaHei"/>
+          <w:b/>
+          <w:sz w:val="20"/>
+        </w:rPr>
+        <w:t>Oracle：</w:t>
+      </w:r>
+      <w:r>
+        <w:rPr>
+          <w:rFonts w:ascii="Microsoft YaHei" w:hAnsi="Microsoft YaHei" w:eastAsia="Microsoft YaHei"/>
+          <w:sz w:val="20"/>
+        </w:rPr>
+        <w:t>守军</w:t>
+        <w:br/>
+      </w:r>
+      <w:r>
+        <w:rPr>
+          <w:rFonts w:ascii="Microsoft YaHei" w:hAnsi="Microsoft YaHei" w:eastAsia="Microsoft YaHei"/>
+          <w:sz w:val="20"/>
+        </w:rPr>
+        <w:t>只要船载火炮能阻挡，则必须阻挡。</w:t>
+        <w:br/>
+      </w:r>
+      <w:r>
+        <w:rPr>
+          <w:rFonts w:ascii="Microsoft YaHei" w:hAnsi="Microsoft YaHei" w:eastAsia="Microsoft YaHei"/>
+          <w:sz w:val="20"/>
+        </w:rPr>
+        <w:t>每当你召唤一个海盗，船载火炮对任一目标造成2点伤害。</w:t>
+      </w:r>
+    </w:p>
+    <w:p>
+      <w:pPr>
+        <w:pStyle w:val="Heading1"/>
+      </w:pPr>
+      <w:r>
+        <w:t>122. 炸药工程师</w:t>
+      </w:r>
+    </w:p>
+    <w:p>
+      <w:r>
+        <w:rPr>
+          <w:rFonts w:ascii="Microsoft YaHei" w:hAnsi="Microsoft YaHei" w:eastAsia="Microsoft YaHei"/>
+          <w:b/>
+          <w:sz w:val="20"/>
+        </w:rPr>
+        <w:t>版本：</w:t>
+      </w:r>
+      <w:r>
+        <w:rPr>
+          <w:rFonts w:ascii="Microsoft YaHei" w:hAnsi="Microsoft YaHei" w:eastAsia="Microsoft YaHei"/>
+          <w:sz w:val="20"/>
+        </w:rPr>
+        <w:t>PH01 / 133</w:t>
+      </w:r>
+    </w:p>
+    <w:p>
+      <w:r>
+        <w:rPr>
+          <w:rFonts w:ascii="Microsoft YaHei" w:hAnsi="Microsoft YaHei" w:eastAsia="Microsoft YaHei"/>
+          <w:b/>
+          <w:sz w:val="20"/>
+        </w:rPr>
+        <w:t>类别：</w:t>
+      </w:r>
+      <w:r>
+        <w:rPr>
+          <w:rFonts w:ascii="Microsoft YaHei" w:hAnsi="Microsoft YaHei" w:eastAsia="Microsoft YaHei"/>
+          <w:sz w:val="20"/>
+        </w:rPr>
+        <w:t>生物～海盗</w:t>
+      </w:r>
+    </w:p>
+    <w:p>
+      <w:r>
+        <w:rPr>
+          <w:rFonts w:ascii="Microsoft YaHei" w:hAnsi="Microsoft YaHei" w:eastAsia="Microsoft YaHei"/>
+          <w:b/>
+          <w:sz w:val="20"/>
+        </w:rPr>
+        <w:t>Oracle：</w:t>
+      </w:r>
+      <w:r>
+        <w:rPr>
+          <w:rFonts w:ascii="Microsoft YaHei" w:hAnsi="Microsoft YaHei" w:eastAsia="Microsoft YaHei"/>
+          <w:sz w:val="20"/>
+        </w:rPr>
+        <w:t>在你的回合中，由你操控的海盗造成的伤害增加1点。</w:t>
+      </w:r>
+    </w:p>
+    <w:p>
+      <w:pPr>
+        <w:pStyle w:val="Heading1"/>
+      </w:pPr>
+      <w:r>
+        <w:t>123. 亚西克瑞非体质</w:t>
+      </w:r>
+    </w:p>
+    <w:p>
+      <w:r>
+        <w:rPr>
+          <w:rFonts w:ascii="Microsoft YaHei" w:hAnsi="Microsoft YaHei" w:eastAsia="Microsoft YaHei"/>
+          <w:b/>
+          <w:sz w:val="20"/>
+        </w:rPr>
+        <w:t>版本：</w:t>
+      </w:r>
+      <w:r>
+        <w:rPr>
+          <w:rFonts w:ascii="Microsoft YaHei" w:hAnsi="Microsoft YaHei" w:eastAsia="Microsoft YaHei"/>
+          <w:sz w:val="20"/>
+        </w:rPr>
+        <w:t>JF99 / 1</w:t>
+      </w:r>
+    </w:p>
+    <w:p>
+      <w:r>
+        <w:rPr>
+          <w:rFonts w:ascii="Microsoft YaHei" w:hAnsi="Microsoft YaHei" w:eastAsia="Microsoft YaHei"/>
+          <w:b/>
+          <w:sz w:val="20"/>
+        </w:rPr>
+        <w:t>类别：</w:t>
+      </w:r>
+      <w:r>
+        <w:rPr>
+          <w:rFonts w:ascii="Microsoft YaHei" w:hAnsi="Microsoft YaHei" w:eastAsia="Microsoft YaHei"/>
+          <w:sz w:val="20"/>
+        </w:rPr>
+        <w:t>结界</w:t>
+      </w:r>
+    </w:p>
+    <w:p>
+      <w:r>
+        <w:rPr>
+          <w:rFonts w:ascii="Microsoft YaHei" w:hAnsi="Microsoft YaHei" w:eastAsia="Microsoft YaHei"/>
+          <w:b/>
+          <w:sz w:val="20"/>
+        </w:rPr>
+        <w:t>Oracle：</w:t>
+      </w:r>
+      <w:r>
+        <w:rPr>
+          <w:rFonts w:ascii="Microsoft YaHei" w:hAnsi="Microsoft YaHei" w:eastAsia="Microsoft YaHei"/>
+          <w:sz w:val="20"/>
+        </w:rPr>
+        <w:t>只要你的总生命为1或更多，你便不会输掉游戏，且你的对手不会赢得游戏。</w:t>
+        <w:br/>
+      </w:r>
+      <w:r>
+        <w:rPr>
+          <w:rFonts w:ascii="Microsoft YaHei" w:hAnsi="Microsoft YaHei" w:eastAsia="Microsoft YaHei"/>
+          <w:sz w:val="20"/>
+        </w:rPr>
+        <w:t>只要你的每位指挥官的颜色标识均为无色，你可以于你能施放瞬间的时机，从你的牌库中展示此牌并将它放进战场。若你如此作，洗牌。每盘游戏只能如此作一次。</w:t>
+      </w:r>
+    </w:p>
+    <w:p>
+      <w:pPr>
+        <w:pStyle w:val="Heading1"/>
+      </w:pPr>
+      <w:r>
+        <w:t>124. 许攸</w:t>
+      </w:r>
+    </w:p>
+    <w:p>
+      <w:r>
+        <w:rPr>
+          <w:rFonts w:ascii="Microsoft YaHei" w:hAnsi="Microsoft YaHei" w:eastAsia="Microsoft YaHei"/>
+          <w:b/>
+          <w:sz w:val="20"/>
+        </w:rPr>
+        <w:t>版本：</w:t>
+      </w:r>
+      <w:r>
+        <w:rPr>
+          <w:rFonts w:ascii="Microsoft YaHei" w:hAnsi="Microsoft YaHei" w:eastAsia="Microsoft YaHei"/>
+          <w:sz w:val="20"/>
+        </w:rPr>
+        <w:t>BT3K / 1</w:t>
+      </w:r>
+    </w:p>
+    <w:p>
+      <w:r>
+        <w:rPr>
+          <w:rFonts w:ascii="Microsoft YaHei" w:hAnsi="Microsoft YaHei" w:eastAsia="Microsoft YaHei"/>
+          <w:b/>
+          <w:sz w:val="20"/>
+        </w:rPr>
+        <w:t>类别：</w:t>
+      </w:r>
+      <w:r>
+        <w:rPr>
+          <w:rFonts w:ascii="Microsoft YaHei" w:hAnsi="Microsoft YaHei" w:eastAsia="Microsoft YaHei"/>
+          <w:sz w:val="20"/>
+        </w:rPr>
+        <w:t>传奇生物～人类／参谋</w:t>
+      </w:r>
+    </w:p>
+    <w:p>
+      <w:r>
+        <w:rPr>
+          <w:rFonts w:ascii="Microsoft YaHei" w:hAnsi="Microsoft YaHei" w:eastAsia="Microsoft YaHei"/>
+          <w:b/>
+          <w:sz w:val="20"/>
+        </w:rPr>
+        <w:t>Oracle：</w:t>
+      </w:r>
+      <w:r>
+        <w:rPr>
+          <w:rFonts w:ascii="Microsoft YaHei" w:hAnsi="Microsoft YaHei" w:eastAsia="Microsoft YaHei"/>
+          <w:sz w:val="20"/>
+        </w:rPr>
+        <w:t>你改为从你的牌库底抓牌。你的对手可以略过其抓牌步骤，然后从你的牌库顶抓至多两张牌。</w:t>
+        <w:br/>
+      </w:r>
+      <w:r>
+        <w:rPr>
+          <w:rFonts w:ascii="Microsoft YaHei" w:hAnsi="Microsoft YaHei" w:eastAsia="Microsoft YaHei"/>
+          <w:sz w:val="20"/>
+        </w:rPr>
+        <w:t>每当你从手上施放一个瞬间或法术咒语时，于该咒语结算时，你可以改为将该牌置于你的牌库顶而非坟墓场。若你如此做，抓一张牌。每种类别至多触发一次。</w:t>
+        <w:br/>
+      </w:r>
+      <w:r>
+        <w:rPr>
+          <w:rFonts w:ascii="Microsoft YaHei" w:hAnsi="Microsoft YaHei" w:eastAsia="Microsoft YaHei"/>
+          <w:sz w:val="20"/>
+        </w:rPr>
+        <w:t>{T}：抓一张牌，然后弃两张牌并在许攸上放置一个转换指示物。</w:t>
+        <w:br/>
+      </w:r>
+      <w:r>
+        <w:rPr>
+          <w:rFonts w:ascii="Microsoft YaHei" w:hAnsi="Microsoft YaHei" w:eastAsia="Microsoft YaHei"/>
+          <w:sz w:val="20"/>
+        </w:rPr>
+        <w:t>{T}，从许攸上移去一个转换指示物：抓两张牌，然后弃一张牌。</w:t>
+      </w:r>
+    </w:p>
+    <w:p>
+      <w:pPr>
+        <w:pStyle w:val="Heading1"/>
+      </w:pPr>
+      <w:r>
+        <w:t>125. 神曹操</w:t>
+      </w:r>
+    </w:p>
+    <w:p>
+      <w:r>
+        <w:rPr>
+          <w:rFonts w:ascii="Microsoft YaHei" w:hAnsi="Microsoft YaHei" w:eastAsia="Microsoft YaHei"/>
+          <w:b/>
+          <w:sz w:val="20"/>
+        </w:rPr>
+        <w:t>版本：</w:t>
+      </w:r>
+      <w:r>
+        <w:rPr>
+          <w:rFonts w:ascii="Microsoft YaHei" w:hAnsi="Microsoft YaHei" w:eastAsia="Microsoft YaHei"/>
+          <w:sz w:val="20"/>
+        </w:rPr>
+        <w:t>BT3K / 2</w:t>
+      </w:r>
+    </w:p>
+    <w:p>
+      <w:r>
+        <w:rPr>
+          <w:rFonts w:ascii="Microsoft YaHei" w:hAnsi="Microsoft YaHei" w:eastAsia="Microsoft YaHei"/>
+          <w:b/>
+          <w:sz w:val="20"/>
+        </w:rPr>
+        <w:t>类别：</w:t>
+      </w:r>
+      <w:r>
+        <w:rPr>
+          <w:rFonts w:ascii="Microsoft YaHei" w:hAnsi="Microsoft YaHei" w:eastAsia="Microsoft YaHei"/>
+          <w:sz w:val="20"/>
+        </w:rPr>
+        <w:t>传奇生物～人类／贵族</w:t>
+      </w:r>
+    </w:p>
+    <w:p>
+      <w:r>
+        <w:rPr>
+          <w:rFonts w:ascii="Microsoft YaHei" w:hAnsi="Microsoft YaHei" w:eastAsia="Microsoft YaHei"/>
+          <w:b/>
+          <w:sz w:val="20"/>
+        </w:rPr>
+        <w:t>Oracle：</w:t>
+      </w:r>
+      <w:r>
+        <w:rPr>
+          <w:rFonts w:ascii="Microsoft YaHei" w:hAnsi="Microsoft YaHei" w:eastAsia="Microsoft YaHei"/>
+          <w:sz w:val="20"/>
+        </w:rPr>
+        <w:t>抵受1。如果一个由对手操控的来源将对你造成伤害，除非该来源的操控者支付{1}，否则防止该伤害。</w:t>
+        <w:br/>
+      </w:r>
+      <w:r>
+        <w:rPr>
+          <w:rFonts w:ascii="Microsoft YaHei" w:hAnsi="Microsoft YaHei" w:eastAsia="Microsoft YaHei"/>
+          <w:sz w:val="20"/>
+        </w:rPr>
+        <w:t>每当一个由对手操控的来源对你造成伤害时，该来源的操控者选择一项——</w:t>
+        <w:br/>
+      </w:r>
+      <w:r>
+        <w:rPr>
+          <w:rFonts w:ascii="Microsoft YaHei" w:hAnsi="Microsoft YaHei" w:eastAsia="Microsoft YaHei"/>
+          <w:sz w:val="20"/>
+        </w:rPr>
+        <w:t>• 选择一个由其操控的永久物。你获得该永久物的操控权。</w:t>
+        <w:br/>
+      </w:r>
+      <w:r>
+        <w:rPr>
+          <w:rFonts w:ascii="Microsoft YaHei" w:hAnsi="Microsoft YaHei" w:eastAsia="Microsoft YaHei"/>
+          <w:sz w:val="20"/>
+        </w:rPr>
+        <w:t>• 从其手牌放逐一张牌。</w:t>
+      </w:r>
+    </w:p>
+    <w:p>
+      <w:pPr>
+        <w:pStyle w:val="Heading1"/>
+      </w:pPr>
+      <w:r>
+        <w:t>126. 魏武帝曹操</w:t>
       </w:r>
     </w:p>
     <w:p>
@@ -8514,6 +8916,73 @@
           <w:sz w:val="20"/>
         </w:rPr>
         <w:t>于这些牌持续被放逐期间，你可以不支付其法术力费用来施放它们。</w:t>
+      </w:r>
+    </w:p>
+    <w:p>
+      <w:pPr>
+        <w:pStyle w:val="Heading1"/>
+      </w:pPr>
+      <w:r>
+        <w:t>127. 于吉</w:t>
+      </w:r>
+    </w:p>
+    <w:p>
+      <w:r>
+        <w:rPr>
+          <w:rFonts w:ascii="Microsoft YaHei" w:hAnsi="Microsoft YaHei" w:eastAsia="Microsoft YaHei"/>
+          <w:b/>
+          <w:sz w:val="20"/>
+        </w:rPr>
+        <w:t>版本：</w:t>
+      </w:r>
+      <w:r>
+        <w:rPr>
+          <w:rFonts w:ascii="Microsoft YaHei" w:hAnsi="Microsoft YaHei" w:eastAsia="Microsoft YaHei"/>
+          <w:sz w:val="20"/>
+        </w:rPr>
+        <w:t>BT3K / 4</w:t>
+      </w:r>
+    </w:p>
+    <w:p>
+      <w:r>
+        <w:rPr>
+          <w:rFonts w:ascii="Microsoft YaHei" w:hAnsi="Microsoft YaHei" w:eastAsia="Microsoft YaHei"/>
+          <w:b/>
+          <w:sz w:val="20"/>
+        </w:rPr>
+        <w:t>类别：</w:t>
+      </w:r>
+      <w:r>
+        <w:rPr>
+          <w:rFonts w:ascii="Microsoft YaHei" w:hAnsi="Microsoft YaHei" w:eastAsia="Microsoft YaHei"/>
+          <w:sz w:val="20"/>
+        </w:rPr>
+        <w:t>传奇生物～人类／祭师</w:t>
+      </w:r>
+    </w:p>
+    <w:p>
+      <w:r>
+        <w:rPr>
+          <w:rFonts w:ascii="Microsoft YaHei" w:hAnsi="Microsoft YaHei" w:eastAsia="Microsoft YaHei"/>
+          <w:b/>
+          <w:sz w:val="20"/>
+        </w:rPr>
+        <w:t>Oracle：</w:t>
+      </w:r>
+      <w:r>
+        <w:rPr>
+          <w:rFonts w:ascii="Microsoft YaHei" w:hAnsi="Microsoft YaHei" w:eastAsia="Microsoft YaHei"/>
+          <w:sz w:val="20"/>
+        </w:rPr>
+        <w:t>每回合中，当你施放第一个名称不是于吉的咒语时，你可以选择一个牌名。每位对手可以选择质疑你。若有牌手如此作，展示你的手牌。若其中没有具该名称的牌，每位质疑你的牌手各从你手上选择一张牌并将其放逐；若其中有具该名称的牌，每位质疑你的牌手各获得一个具有「你不能质疑」的徽记。</w:t>
+        <w:br/>
+      </w:r>
+      <w:r>
+        <w:rPr>
+          <w:rFonts w:ascii="Microsoft YaHei" w:hAnsi="Microsoft YaHei" w:eastAsia="Microsoft YaHei"/>
+          <w:sz w:val="20"/>
+        </w:rPr>
+        <w:t>若无人质疑你，或质疑失败，你可以视同该咒语为具所选牌名的牌来施放，并支付该牌的法术力费用而非该咒语的法术力费用。</w:t>
       </w:r>
     </w:p>
     <w:sectPr>

</xml_diff>

<commit_message>
Fix Aya entity emblems and Cunning potion
</commit_message>
<xml_diff>
--- a/custom/DIY卡牌_游戏内Oracle_非测试卡.docx
+++ b/custom/DIY卡牌_游戏内Oracle_非测试卡.docx
@@ -17,7 +17,7 @@
     </w:p>
     <w:p>
       <w:r>
-        <w:t>已隐藏 Gigantic Spright；当前共 127 张非测试 DIY 卡。本次 wording 审校 117 张，未改动 10 张炉石泰坦卡牌。</w:t>
+        <w:t>已隐藏 Gigantic Spright；当前共 131 张非测试 DIY 卡。本次 wording 审校 121 张，未改动 10 张炉石泰坦卡牌。</w:t>
       </w:r>
     </w:p>
     <w:p>
@@ -7594,7 +7594,7 @@
           <w:rFonts w:ascii="Microsoft YaHei" w:hAnsi="Microsoft YaHei" w:eastAsia="Microsoft YaHei"/>
           <w:sz w:val="20"/>
         </w:rPr>
-        <w:t>• 每当你牺牲一个珍宝衍生物时，你可以支付{1}。若如此作，抓一张牌。</w:t>
+        <w:t>• 每当你牺牲一个珍宝衍生物时，化生一张伪造的药水并置入你的手牌。</w:t>
       </w:r>
     </w:p>
     <w:p>
@@ -8615,7 +8615,7 @@
         <w:pStyle w:val="Heading1"/>
       </w:pPr>
       <w:r>
-        <w:t>123. 亚西克瑞非体质</w:t>
+        <w:t>123. Emblem — Aya's Jade Treasure</w:t>
       </w:r>
     </w:p>
     <w:p>
@@ -8632,7 +8632,7 @@
           <w:rFonts w:ascii="Microsoft YaHei" w:hAnsi="Microsoft YaHei" w:eastAsia="Microsoft YaHei"/>
           <w:sz w:val="20"/>
         </w:rPr>
-        <w:t>JF99 / 1</w:t>
+        <w:t>PH01 / 134</w:t>
       </w:r>
     </w:p>
     <w:p>
@@ -8649,7 +8649,7 @@
           <w:rFonts w:ascii="Microsoft YaHei" w:hAnsi="Microsoft YaHei" w:eastAsia="Microsoft YaHei"/>
           <w:sz w:val="20"/>
         </w:rPr>
-        <w:t>结界</w:t>
+        <w:t>徽记</w:t>
       </w:r>
     </w:p>
     <w:p>
@@ -8666,15 +8666,7 @@
           <w:rFonts w:ascii="Microsoft YaHei" w:hAnsi="Microsoft YaHei" w:eastAsia="Microsoft YaHei"/>
           <w:sz w:val="20"/>
         </w:rPr>
-        <w:t>只要你的总生命为1或更多，你便不会输掉游戏，且你的对手不会赢得游戏。</w:t>
-        <w:br/>
-      </w:r>
-      <w:r>
-        <w:rPr>
-          <w:rFonts w:ascii="Microsoft YaHei" w:hAnsi="Microsoft YaHei" w:eastAsia="Microsoft YaHei"/>
-          <w:sz w:val="20"/>
-        </w:rPr>
-        <w:t>只要你的每位指挥官的颜色标识均为无色，你可以于你能施放瞬间的时机，从你的牌库中展示此牌并将它放进战场。若你如此作，洗牌。每盘游戏只能如此作一次。</w:t>
+        <w:t>每当你牺牲一个珍宝衍生物时，派出一个青玉魔像。</w:t>
       </w:r>
     </w:p>
     <w:p>
@@ -8682,7 +8674,7 @@
         <w:pStyle w:val="Heading1"/>
       </w:pPr>
       <w:r>
-        <w:t>124. 许攸</w:t>
+        <w:t>124. Emblem — Aya's Burst Treasure</w:t>
       </w:r>
     </w:p>
     <w:p>
@@ -8699,7 +8691,7 @@
           <w:rFonts w:ascii="Microsoft YaHei" w:hAnsi="Microsoft YaHei" w:eastAsia="Microsoft YaHei"/>
           <w:sz w:val="20"/>
         </w:rPr>
-        <w:t>BT3K / 1</w:t>
+        <w:t>PH01 / 135</w:t>
       </w:r>
     </w:p>
     <w:p>
@@ -8716,7 +8708,7 @@
           <w:rFonts w:ascii="Microsoft YaHei" w:hAnsi="Microsoft YaHei" w:eastAsia="Microsoft YaHei"/>
           <w:sz w:val="20"/>
         </w:rPr>
-        <w:t>传奇生物～人类／参谋</w:t>
+        <w:t>徽记</w:t>
       </w:r>
     </w:p>
     <w:p>
@@ -8733,31 +8725,7 @@
           <w:rFonts w:ascii="Microsoft YaHei" w:hAnsi="Microsoft YaHei" w:eastAsia="Microsoft YaHei"/>
           <w:sz w:val="20"/>
         </w:rPr>
-        <w:t>你改为从你的牌库底抓牌。你的对手可以略过其抓牌步骤，然后从你的牌库顶抓至多两张牌。</w:t>
-        <w:br/>
-      </w:r>
-      <w:r>
-        <w:rPr>
-          <w:rFonts w:ascii="Microsoft YaHei" w:hAnsi="Microsoft YaHei" w:eastAsia="Microsoft YaHei"/>
-          <w:sz w:val="20"/>
-        </w:rPr>
-        <w:t>每当你从手上施放一个瞬间或法术咒语时，于该咒语结算时，你可以改为将该牌置于你的牌库顶而非坟墓场。若你如此做，抓一张牌。每种类别至多触发一次。</w:t>
-        <w:br/>
-      </w:r>
-      <w:r>
-        <w:rPr>
-          <w:rFonts w:ascii="Microsoft YaHei" w:hAnsi="Microsoft YaHei" w:eastAsia="Microsoft YaHei"/>
-          <w:sz w:val="20"/>
-        </w:rPr>
-        <w:t>{T}：抓一张牌，然后弃两张牌并在许攸上放置一个转换指示物。</w:t>
-        <w:br/>
-      </w:r>
-      <w:r>
-        <w:rPr>
-          <w:rFonts w:ascii="Microsoft YaHei" w:hAnsi="Microsoft YaHei" w:eastAsia="Microsoft YaHei"/>
-          <w:sz w:val="20"/>
-        </w:rPr>
-        <w:t>{T}，从许攸上移去一个转换指示物：抓两张牌，然后弃一张牌。</w:t>
+        <w:t>每当你牺牲一个珍宝衍生物时，此徽记对一个随机选择的目标造成2点伤害，该目标须既不是你，也不是由你操控的永久物。</w:t>
       </w:r>
     </w:p>
     <w:p>
@@ -8765,7 +8733,7 @@
         <w:pStyle w:val="Heading1"/>
       </w:pPr>
       <w:r>
-        <w:t>125. 神曹操</w:t>
+        <w:t>125. Emblem — Aya's Cunning Treasure</w:t>
       </w:r>
     </w:p>
     <w:p>
@@ -8782,7 +8750,7 @@
           <w:rFonts w:ascii="Microsoft YaHei" w:hAnsi="Microsoft YaHei" w:eastAsia="Microsoft YaHei"/>
           <w:sz w:val="20"/>
         </w:rPr>
-        <w:t>BT3K / 2</w:t>
+        <w:t>PH01 / 136</w:t>
       </w:r>
     </w:p>
     <w:p>
@@ -8799,7 +8767,7 @@
           <w:rFonts w:ascii="Microsoft YaHei" w:hAnsi="Microsoft YaHei" w:eastAsia="Microsoft YaHei"/>
           <w:sz w:val="20"/>
         </w:rPr>
-        <w:t>传奇生物～人类／贵族</w:t>
+        <w:t>徽记</w:t>
       </w:r>
     </w:p>
     <w:p>
@@ -8816,31 +8784,7 @@
           <w:rFonts w:ascii="Microsoft YaHei" w:hAnsi="Microsoft YaHei" w:eastAsia="Microsoft YaHei"/>
           <w:sz w:val="20"/>
         </w:rPr>
-        <w:t>抵受1。如果一个由对手操控的来源将对你造成伤害，除非该来源的操控者支付{1}，否则防止该伤害。</w:t>
-        <w:br/>
-      </w:r>
-      <w:r>
-        <w:rPr>
-          <w:rFonts w:ascii="Microsoft YaHei" w:hAnsi="Microsoft YaHei" w:eastAsia="Microsoft YaHei"/>
-          <w:sz w:val="20"/>
-        </w:rPr>
-        <w:t>每当一个由对手操控的来源对你造成伤害时，该来源的操控者选择一项——</w:t>
-        <w:br/>
-      </w:r>
-      <w:r>
-        <w:rPr>
-          <w:rFonts w:ascii="Microsoft YaHei" w:hAnsi="Microsoft YaHei" w:eastAsia="Microsoft YaHei"/>
-          <w:sz w:val="20"/>
-        </w:rPr>
-        <w:t>• 选择一个由其操控的永久物。你获得该永久物的操控权。</w:t>
-        <w:br/>
-      </w:r>
-      <w:r>
-        <w:rPr>
-          <w:rFonts w:ascii="Microsoft YaHei" w:hAnsi="Microsoft YaHei" w:eastAsia="Microsoft YaHei"/>
-          <w:sz w:val="20"/>
-        </w:rPr>
-        <w:t>• 从其手牌放逐一张牌。</w:t>
+        <w:t>每当你牺牲一个珍宝衍生物时，化生一张伪造的药水并置入你的手牌。</w:t>
       </w:r>
     </w:p>
     <w:p>
@@ -8848,7 +8792,7 @@
         <w:pStyle w:val="Heading1"/>
       </w:pPr>
       <w:r>
-        <w:t>126. 魏武帝曹操</w:t>
+        <w:t>126. 亚西克瑞非体质</w:t>
       </w:r>
     </w:p>
     <w:p>
@@ -8865,7 +8809,7 @@
           <w:rFonts w:ascii="Microsoft YaHei" w:hAnsi="Microsoft YaHei" w:eastAsia="Microsoft YaHei"/>
           <w:sz w:val="20"/>
         </w:rPr>
-        <w:t>BT3K / 3</w:t>
+        <w:t>JF99 / 1</w:t>
       </w:r>
     </w:p>
     <w:p>
@@ -8882,7 +8826,7 @@
           <w:rFonts w:ascii="Microsoft YaHei" w:hAnsi="Microsoft YaHei" w:eastAsia="Microsoft YaHei"/>
           <w:sz w:val="20"/>
         </w:rPr>
-        <w:t>传奇生物～人类／贵族</w:t>
+        <w:t>结界</w:t>
       </w:r>
     </w:p>
     <w:p>
@@ -8899,7 +8843,7 @@
           <w:rFonts w:ascii="Microsoft YaHei" w:hAnsi="Microsoft YaHei" w:eastAsia="Microsoft YaHei"/>
           <w:sz w:val="20"/>
         </w:rPr>
-        <w:t>守护～弃两张牌。</w:t>
+        <w:t>只要你的总生命为1或更多，你便不会输掉游戏，且你的对手不会赢得游戏。</w:t>
         <w:br/>
       </w:r>
       <w:r>
@@ -8907,15 +8851,7 @@
           <w:rFonts w:ascii="Microsoft YaHei" w:hAnsi="Microsoft YaHei" w:eastAsia="Microsoft YaHei"/>
           <w:sz w:val="20"/>
         </w:rPr>
-        <w:t>奸雄 — 如果一个不由你操控且本回合曾对你造成过伤害的瞬间或法术咒语将因结算而置入坟墓场，改为将它放逐。</w:t>
-        <w:br/>
-      </w:r>
-      <w:r>
-        <w:rPr>
-          <w:rFonts w:ascii="Microsoft YaHei" w:hAnsi="Microsoft YaHei" w:eastAsia="Microsoft YaHei"/>
-          <w:sz w:val="20"/>
-        </w:rPr>
-        <w:t>于这些牌持续被放逐期间，你可以不支付其法术力费用来施放它们。</w:t>
+        <w:t>只要你的每位指挥官的颜色标识均为无色，你可以于你能施放瞬间的时机，从你的牌库中展示此牌并将它放进战场。若你如此作，洗牌。每盘游戏只能如此作一次。</w:t>
       </w:r>
     </w:p>
     <w:p>
@@ -8923,7 +8859,248 @@
         <w:pStyle w:val="Heading1"/>
       </w:pPr>
       <w:r>
-        <w:t>127. 于吉</w:t>
+        <w:t>127. 许攸</w:t>
+      </w:r>
+    </w:p>
+    <w:p>
+      <w:r>
+        <w:rPr>
+          <w:rFonts w:ascii="Microsoft YaHei" w:hAnsi="Microsoft YaHei" w:eastAsia="Microsoft YaHei"/>
+          <w:b/>
+          <w:sz w:val="20"/>
+        </w:rPr>
+        <w:t>版本：</w:t>
+      </w:r>
+      <w:r>
+        <w:rPr>
+          <w:rFonts w:ascii="Microsoft YaHei" w:hAnsi="Microsoft YaHei" w:eastAsia="Microsoft YaHei"/>
+          <w:sz w:val="20"/>
+        </w:rPr>
+        <w:t>BT3K / 1</w:t>
+      </w:r>
+    </w:p>
+    <w:p>
+      <w:r>
+        <w:rPr>
+          <w:rFonts w:ascii="Microsoft YaHei" w:hAnsi="Microsoft YaHei" w:eastAsia="Microsoft YaHei"/>
+          <w:b/>
+          <w:sz w:val="20"/>
+        </w:rPr>
+        <w:t>类别：</w:t>
+      </w:r>
+      <w:r>
+        <w:rPr>
+          <w:rFonts w:ascii="Microsoft YaHei" w:hAnsi="Microsoft YaHei" w:eastAsia="Microsoft YaHei"/>
+          <w:sz w:val="20"/>
+        </w:rPr>
+        <w:t>传奇生物～人类／参谋</w:t>
+      </w:r>
+    </w:p>
+    <w:p>
+      <w:r>
+        <w:rPr>
+          <w:rFonts w:ascii="Microsoft YaHei" w:hAnsi="Microsoft YaHei" w:eastAsia="Microsoft YaHei"/>
+          <w:b/>
+          <w:sz w:val="20"/>
+        </w:rPr>
+        <w:t>Oracle：</w:t>
+      </w:r>
+      <w:r>
+        <w:rPr>
+          <w:rFonts w:ascii="Microsoft YaHei" w:hAnsi="Microsoft YaHei" w:eastAsia="Microsoft YaHei"/>
+          <w:sz w:val="20"/>
+        </w:rPr>
+        <w:t>你改为从你的牌库底抓牌。你的对手可以略过其抓牌步骤，然后从你的牌库顶抓至多两张牌。</w:t>
+        <w:br/>
+      </w:r>
+      <w:r>
+        <w:rPr>
+          <w:rFonts w:ascii="Microsoft YaHei" w:hAnsi="Microsoft YaHei" w:eastAsia="Microsoft YaHei"/>
+          <w:sz w:val="20"/>
+        </w:rPr>
+        <w:t>每当你从手上施放一个瞬间或法术咒语时，于该咒语结算时，你可以改为将该牌置于你的牌库顶而非坟墓场。若你如此做，抓一张牌。每种类别至多触发一次。</w:t>
+        <w:br/>
+      </w:r>
+      <w:r>
+        <w:rPr>
+          <w:rFonts w:ascii="Microsoft YaHei" w:hAnsi="Microsoft YaHei" w:eastAsia="Microsoft YaHei"/>
+          <w:sz w:val="20"/>
+        </w:rPr>
+        <w:t>{T}：抓一张牌，然后弃两张牌并在许攸上放置一个转换指示物。</w:t>
+        <w:br/>
+      </w:r>
+      <w:r>
+        <w:rPr>
+          <w:rFonts w:ascii="Microsoft YaHei" w:hAnsi="Microsoft YaHei" w:eastAsia="Microsoft YaHei"/>
+          <w:sz w:val="20"/>
+        </w:rPr>
+        <w:t>{T}，从许攸上移去一个转换指示物：抓两张牌，然后弃一张牌。</w:t>
+      </w:r>
+    </w:p>
+    <w:p>
+      <w:pPr>
+        <w:pStyle w:val="Heading1"/>
+      </w:pPr>
+      <w:r>
+        <w:t>128. 神曹操</w:t>
+      </w:r>
+    </w:p>
+    <w:p>
+      <w:r>
+        <w:rPr>
+          <w:rFonts w:ascii="Microsoft YaHei" w:hAnsi="Microsoft YaHei" w:eastAsia="Microsoft YaHei"/>
+          <w:b/>
+          <w:sz w:val="20"/>
+        </w:rPr>
+        <w:t>版本：</w:t>
+      </w:r>
+      <w:r>
+        <w:rPr>
+          <w:rFonts w:ascii="Microsoft YaHei" w:hAnsi="Microsoft YaHei" w:eastAsia="Microsoft YaHei"/>
+          <w:sz w:val="20"/>
+        </w:rPr>
+        <w:t>BT3K / 2</w:t>
+      </w:r>
+    </w:p>
+    <w:p>
+      <w:r>
+        <w:rPr>
+          <w:rFonts w:ascii="Microsoft YaHei" w:hAnsi="Microsoft YaHei" w:eastAsia="Microsoft YaHei"/>
+          <w:b/>
+          <w:sz w:val="20"/>
+        </w:rPr>
+        <w:t>类别：</w:t>
+      </w:r>
+      <w:r>
+        <w:rPr>
+          <w:rFonts w:ascii="Microsoft YaHei" w:hAnsi="Microsoft YaHei" w:eastAsia="Microsoft YaHei"/>
+          <w:sz w:val="20"/>
+        </w:rPr>
+        <w:t>传奇生物～人类／贵族</w:t>
+      </w:r>
+    </w:p>
+    <w:p>
+      <w:r>
+        <w:rPr>
+          <w:rFonts w:ascii="Microsoft YaHei" w:hAnsi="Microsoft YaHei" w:eastAsia="Microsoft YaHei"/>
+          <w:b/>
+          <w:sz w:val="20"/>
+        </w:rPr>
+        <w:t>Oracle：</w:t>
+      </w:r>
+      <w:r>
+        <w:rPr>
+          <w:rFonts w:ascii="Microsoft YaHei" w:hAnsi="Microsoft YaHei" w:eastAsia="Microsoft YaHei"/>
+          <w:sz w:val="20"/>
+        </w:rPr>
+        <w:t>抵受1。如果一个由对手操控的来源将对你造成伤害，除非该来源的操控者支付{1}，否则防止该伤害。</w:t>
+        <w:br/>
+      </w:r>
+      <w:r>
+        <w:rPr>
+          <w:rFonts w:ascii="Microsoft YaHei" w:hAnsi="Microsoft YaHei" w:eastAsia="Microsoft YaHei"/>
+          <w:sz w:val="20"/>
+        </w:rPr>
+        <w:t>每当一个由对手操控的来源对你造成伤害时，该来源的操控者选择一项——</w:t>
+        <w:br/>
+      </w:r>
+      <w:r>
+        <w:rPr>
+          <w:rFonts w:ascii="Microsoft YaHei" w:hAnsi="Microsoft YaHei" w:eastAsia="Microsoft YaHei"/>
+          <w:sz w:val="20"/>
+        </w:rPr>
+        <w:t>• 选择一个由其操控的永久物。你获得该永久物的操控权。</w:t>
+        <w:br/>
+      </w:r>
+      <w:r>
+        <w:rPr>
+          <w:rFonts w:ascii="Microsoft YaHei" w:hAnsi="Microsoft YaHei" w:eastAsia="Microsoft YaHei"/>
+          <w:sz w:val="20"/>
+        </w:rPr>
+        <w:t>• 从其手牌放逐一张牌。</w:t>
+      </w:r>
+    </w:p>
+    <w:p>
+      <w:pPr>
+        <w:pStyle w:val="Heading1"/>
+      </w:pPr>
+      <w:r>
+        <w:t>129. 魏武帝曹操</w:t>
+      </w:r>
+    </w:p>
+    <w:p>
+      <w:r>
+        <w:rPr>
+          <w:rFonts w:ascii="Microsoft YaHei" w:hAnsi="Microsoft YaHei" w:eastAsia="Microsoft YaHei"/>
+          <w:b/>
+          <w:sz w:val="20"/>
+        </w:rPr>
+        <w:t>版本：</w:t>
+      </w:r>
+      <w:r>
+        <w:rPr>
+          <w:rFonts w:ascii="Microsoft YaHei" w:hAnsi="Microsoft YaHei" w:eastAsia="Microsoft YaHei"/>
+          <w:sz w:val="20"/>
+        </w:rPr>
+        <w:t>BT3K / 3</w:t>
+      </w:r>
+    </w:p>
+    <w:p>
+      <w:r>
+        <w:rPr>
+          <w:rFonts w:ascii="Microsoft YaHei" w:hAnsi="Microsoft YaHei" w:eastAsia="Microsoft YaHei"/>
+          <w:b/>
+          <w:sz w:val="20"/>
+        </w:rPr>
+        <w:t>类别：</w:t>
+      </w:r>
+      <w:r>
+        <w:rPr>
+          <w:rFonts w:ascii="Microsoft YaHei" w:hAnsi="Microsoft YaHei" w:eastAsia="Microsoft YaHei"/>
+          <w:sz w:val="20"/>
+        </w:rPr>
+        <w:t>传奇生物～人类／贵族</w:t>
+      </w:r>
+    </w:p>
+    <w:p>
+      <w:r>
+        <w:rPr>
+          <w:rFonts w:ascii="Microsoft YaHei" w:hAnsi="Microsoft YaHei" w:eastAsia="Microsoft YaHei"/>
+          <w:b/>
+          <w:sz w:val="20"/>
+        </w:rPr>
+        <w:t>Oracle：</w:t>
+      </w:r>
+      <w:r>
+        <w:rPr>
+          <w:rFonts w:ascii="Microsoft YaHei" w:hAnsi="Microsoft YaHei" w:eastAsia="Microsoft YaHei"/>
+          <w:sz w:val="20"/>
+        </w:rPr>
+        <w:t>守护～弃两张牌。</w:t>
+        <w:br/>
+      </w:r>
+      <w:r>
+        <w:rPr>
+          <w:rFonts w:ascii="Microsoft YaHei" w:hAnsi="Microsoft YaHei" w:eastAsia="Microsoft YaHei"/>
+          <w:sz w:val="20"/>
+        </w:rPr>
+        <w:t>奸雄 — 如果一个不由你操控且本回合曾对你造成过伤害的瞬间或法术咒语将因结算而置入坟墓场，改为将它放逐。</w:t>
+        <w:br/>
+      </w:r>
+      <w:r>
+        <w:rPr>
+          <w:rFonts w:ascii="Microsoft YaHei" w:hAnsi="Microsoft YaHei" w:eastAsia="Microsoft YaHei"/>
+          <w:sz w:val="20"/>
+        </w:rPr>
+        <w:t>于这些牌持续被放逐期间，你可以不支付其法术力费用来施放它们。</w:t>
+      </w:r>
+    </w:p>
+    <w:p>
+      <w:pPr>
+        <w:pStyle w:val="Heading1"/>
+      </w:pPr>
+      <w:r>
+        <w:t>130. 于吉</w:t>
       </w:r>
     </w:p>
     <w:p>
@@ -8983,6 +9160,137 @@
           <w:sz w:val="20"/>
         </w:rPr>
         <w:t>若无人质疑你，或质疑失败，你可以视同该咒语为具所选牌名的牌来施放，并支付该牌的法术力费用而非该咒语的法术力费用。</w:t>
+      </w:r>
+    </w:p>
+    <w:p>
+      <w:pPr>
+        <w:pStyle w:val="Heading1"/>
+      </w:pPr>
+      <w:r>
+        <w:t>131. 伪造的药水</w:t>
+      </w:r>
+    </w:p>
+    <w:p>
+      <w:r>
+        <w:rPr>
+          <w:rFonts w:ascii="Microsoft YaHei" w:hAnsi="Microsoft YaHei" w:eastAsia="Microsoft YaHei"/>
+          <w:b/>
+          <w:sz w:val="20"/>
+        </w:rPr>
+        <w:t>版本：</w:t>
+      </w:r>
+      <w:r>
+        <w:rPr>
+          <w:rFonts w:ascii="Microsoft YaHei" w:hAnsi="Microsoft YaHei" w:eastAsia="Microsoft YaHei"/>
+          <w:sz w:val="20"/>
+        </w:rPr>
+        <w:t>TOKEN_HS / 2</w:t>
+      </w:r>
+    </w:p>
+    <w:p>
+      <w:r>
+        <w:rPr>
+          <w:rFonts w:ascii="Microsoft YaHei" w:hAnsi="Microsoft YaHei" w:eastAsia="Microsoft YaHei"/>
+          <w:b/>
+          <w:sz w:val="20"/>
+        </w:rPr>
+        <w:t>类别：</w:t>
+      </w:r>
+      <w:r>
+        <w:rPr>
+          <w:rFonts w:ascii="Microsoft YaHei" w:hAnsi="Microsoft YaHei" w:eastAsia="Microsoft YaHei"/>
+          <w:sz w:val="20"/>
+        </w:rPr>
+        <w:t>法术</w:t>
+      </w:r>
+    </w:p>
+    <w:p>
+      <w:r>
+        <w:rPr>
+          <w:rFonts w:ascii="Microsoft YaHei" w:hAnsi="Microsoft YaHei" w:eastAsia="Microsoft YaHei"/>
+          <w:b/>
+          <w:sz w:val="20"/>
+        </w:rPr>
+        <w:t>Oracle：</w:t>
+      </w:r>
+      <w:r>
+        <w:rPr>
+          <w:rFonts w:ascii="Microsoft YaHei" w:hAnsi="Microsoft YaHei" w:eastAsia="Microsoft YaHei"/>
+          <w:sz w:val="20"/>
+        </w:rPr>
+        <w:t>选择一项：</w:t>
+        <w:br/>
+      </w:r>
+      <w:r>
+        <w:rPr>
+          <w:rFonts w:ascii="Microsoft YaHei" w:hAnsi="Microsoft YaHei" w:eastAsia="Microsoft YaHei"/>
+          <w:sz w:val="20"/>
+        </w:rPr>
+        <w:t>• 派出一个2/2的恶魔衍生生物。</w:t>
+        <w:br/>
+      </w:r>
+      <w:r>
+        <w:rPr>
+          <w:rFonts w:ascii="Microsoft YaHei" w:hAnsi="Microsoft YaHei" w:eastAsia="Microsoft YaHei"/>
+          <w:sz w:val="20"/>
+        </w:rPr>
+        <w:t>• 发现一张恶魔牌。</w:t>
+        <w:br/>
+      </w:r>
+      <w:r>
+        <w:rPr>
+          <w:rFonts w:ascii="Microsoft YaHei" w:hAnsi="Microsoft YaHei" w:eastAsia="Microsoft YaHei"/>
+          <w:sz w:val="20"/>
+        </w:rPr>
+        <w:t>• 抓一张牌。</w:t>
+        <w:br/>
+      </w:r>
+      <w:r>
+        <w:rPr>
+          <w:rFonts w:ascii="Microsoft YaHei" w:hAnsi="Microsoft YaHei" w:eastAsia="Microsoft YaHei"/>
+          <w:sz w:val="20"/>
+        </w:rPr>
+        <w:t>• 伪造的药水对任一目标造成3点伤害。</w:t>
+        <w:br/>
+      </w:r>
+      <w:r>
+        <w:rPr>
+          <w:rFonts w:ascii="Microsoft YaHei" w:hAnsi="Microsoft YaHei" w:eastAsia="Microsoft YaHei"/>
+          <w:sz w:val="20"/>
+        </w:rPr>
+        <w:t>• 横置目标生物。它在其操控者的下个重置步骤中不能重置。</w:t>
+        <w:br/>
+      </w:r>
+      <w:r>
+        <w:rPr>
+          <w:rFonts w:ascii="Microsoft YaHei" w:hAnsi="Microsoft YaHei" w:eastAsia="Microsoft YaHei"/>
+          <w:sz w:val="20"/>
+        </w:rPr>
+        <w:t>• 你的每个生物永久得+0/+2。</w:t>
+        <w:br/>
+      </w:r>
+      <w:r>
+        <w:rPr>
+          <w:rFonts w:ascii="Microsoft YaHei" w:hAnsi="Microsoft YaHei" w:eastAsia="Microsoft YaHei"/>
+          <w:sz w:val="20"/>
+        </w:rPr>
+        <w:t>• 所有生物得-0/-2直到回合结束。</w:t>
+        <w:br/>
+      </w:r>
+      <w:r>
+        <w:rPr>
+          <w:rFonts w:ascii="Microsoft YaHei" w:hAnsi="Microsoft YaHei" w:eastAsia="Microsoft YaHei"/>
+          <w:sz w:val="20"/>
+        </w:rPr>
+        <w:t>• 随机将一个生物从你的坟墓场移回战场。</w:t>
+        <w:br/>
+      </w:r>
+      <w:r>
+        <w:rPr>
+          <w:rFonts w:ascii="Microsoft YaHei" w:hAnsi="Microsoft YaHei" w:eastAsia="Microsoft YaHei"/>
+          <w:sz w:val="20"/>
+        </w:rPr>
+        <w:t>• 获得4点生命。</w:t>
       </w:r>
     </w:p>
     <w:sectPr>

</xml_diff>

<commit_message>
Add Toy Boat and finish card fixes
# Conflicts:
#	custom/CARDS.md
#	custom/editions/Placeholder_Set.txt
</commit_message>
<xml_diff>
--- a/custom/DIY卡牌_游戏内Oracle_非测试卡.docx
+++ b/custom/DIY卡牌_游戏内Oracle_非测试卡.docx
@@ -17,7 +17,7 @@
     </w:p>
     <w:p>
       <w:r>
-        <w:t>已隐藏 Gigantic Spright；当前共 131 张非测试 DIY 卡。本次 wording 审校 121 张，未改动 10 张炉石泰坦卡牌。</w:t>
+        <w:t>已隐藏 Gigantic Spright；当前共 132 张非测试 DIY 卡。本次 wording 审校 122 张，未改动 10 张炉石泰坦卡牌。</w:t>
       </w:r>
     </w:p>
     <w:p>
@@ -135,6 +135,14 @@
           <w:rFonts w:ascii="Microsoft YaHei" w:hAnsi="Microsoft YaHei" w:eastAsia="Microsoft YaHei"/>
           <w:sz w:val="20"/>
         </w:rPr>
+        <w:t>你的起始套牌中不能含有多于一张名为破链灾星霍格的牌。</w:t>
+        <w:br/>
+      </w:r>
+      <w:r>
+        <w:rPr>
+          <w:rFonts w:ascii="Microsoft YaHei" w:hAnsi="Microsoft YaHei" w:eastAsia="Microsoft YaHei"/>
+          <w:sz w:val="20"/>
+        </w:rPr>
         <w:t>超级延势</w:t>
         <w:br/>
       </w:r>
@@ -8355,7 +8363,7 @@
           <w:rFonts w:ascii="Microsoft YaHei" w:hAnsi="Microsoft YaHei" w:eastAsia="Microsoft YaHei"/>
           <w:sz w:val="20"/>
         </w:rPr>
-        <w:t>在你召唤一个海盗后，使其永久获得+1攻击力。</w:t>
+        <w:t>每当你召唤一个海盗时，使其永久得+1/+0。</w:t>
       </w:r>
     </w:p>
     <w:p>
@@ -8615,7 +8623,7 @@
         <w:pStyle w:val="Heading1"/>
       </w:pPr>
       <w:r>
-        <w:t>123. Emblem — Aya's Jade Treasure</w:t>
+        <w:t>123. 玩具船</w:t>
       </w:r>
     </w:p>
     <w:p>
@@ -8632,7 +8640,7 @@
           <w:rFonts w:ascii="Microsoft YaHei" w:hAnsi="Microsoft YaHei" w:eastAsia="Microsoft YaHei"/>
           <w:sz w:val="20"/>
         </w:rPr>
-        <w:t>PH01 / 134</w:t>
+        <w:t>PH01 / 137</w:t>
       </w:r>
     </w:p>
     <w:p>
@@ -8649,7 +8657,7 @@
           <w:rFonts w:ascii="Microsoft YaHei" w:hAnsi="Microsoft YaHei" w:eastAsia="Microsoft YaHei"/>
           <w:sz w:val="20"/>
         </w:rPr>
-        <w:t>徽记</w:t>
+        <w:t>神器生物～船</w:t>
       </w:r>
     </w:p>
     <w:p>
@@ -8666,7 +8674,23 @@
           <w:rFonts w:ascii="Microsoft YaHei" w:hAnsi="Microsoft YaHei" w:eastAsia="Microsoft YaHei"/>
           <w:sz w:val="20"/>
         </w:rPr>
-        <w:t>每当你牺牲一个珍宝衍生物时，派出一个青玉魔像。</w:t>
+        <w:t>守军</w:t>
+        <w:br/>
+      </w:r>
+      <w:r>
+        <w:rPr>
+          <w:rFonts w:ascii="Microsoft YaHei" w:hAnsi="Microsoft YaHei" w:eastAsia="Microsoft YaHei"/>
+          <w:sz w:val="20"/>
+        </w:rPr>
+        <w:t>只要玩具船可以阻挡，则它必须阻挡。</w:t>
+        <w:br/>
+      </w:r>
+      <w:r>
+        <w:rPr>
+          <w:rFonts w:ascii="Microsoft YaHei" w:hAnsi="Microsoft YaHei" w:eastAsia="Microsoft YaHei"/>
+          <w:sz w:val="20"/>
+        </w:rPr>
+        <w:t>每当你召唤一个海盗时，抓一张牌。</w:t>
       </w:r>
     </w:p>
     <w:p>
@@ -8674,7 +8698,7 @@
         <w:pStyle w:val="Heading1"/>
       </w:pPr>
       <w:r>
-        <w:t>124. Emblem — Aya's Burst Treasure</w:t>
+        <w:t>124. 亚西克瑞非体质</w:t>
       </w:r>
     </w:p>
     <w:p>
@@ -8691,7 +8715,7 @@
           <w:rFonts w:ascii="Microsoft YaHei" w:hAnsi="Microsoft YaHei" w:eastAsia="Microsoft YaHei"/>
           <w:sz w:val="20"/>
         </w:rPr>
-        <w:t>PH01 / 135</w:t>
+        <w:t>JF99 / 1</w:t>
       </w:r>
     </w:p>
     <w:p>
@@ -8708,7 +8732,7 @@
           <w:rFonts w:ascii="Microsoft YaHei" w:hAnsi="Microsoft YaHei" w:eastAsia="Microsoft YaHei"/>
           <w:sz w:val="20"/>
         </w:rPr>
-        <w:t>徽记</w:t>
+        <w:t>结界</w:t>
       </w:r>
     </w:p>
     <w:p>
@@ -8725,7 +8749,15 @@
           <w:rFonts w:ascii="Microsoft YaHei" w:hAnsi="Microsoft YaHei" w:eastAsia="Microsoft YaHei"/>
           <w:sz w:val="20"/>
         </w:rPr>
-        <w:t>每当你牺牲一个珍宝衍生物时，此徽记对一个随机选择的目标造成2点伤害，该目标须既不是你，也不是由你操控的永久物。</w:t>
+        <w:t>只要你的总生命为1或更多，你便不会输掉游戏，且你的对手不会赢得游戏。</w:t>
+        <w:br/>
+      </w:r>
+      <w:r>
+        <w:rPr>
+          <w:rFonts w:ascii="Microsoft YaHei" w:hAnsi="Microsoft YaHei" w:eastAsia="Microsoft YaHei"/>
+          <w:sz w:val="20"/>
+        </w:rPr>
+        <w:t>只要你的每位指挥官的颜色标识均为无色，你可以于你能施放瞬间的时机，从你的牌库中展示此牌并将它放进战场。若你如此作，洗牌。每盘游戏只能如此作一次。</w:t>
       </w:r>
     </w:p>
     <w:p>
@@ -8733,7 +8765,7 @@
         <w:pStyle w:val="Heading1"/>
       </w:pPr>
       <w:r>
-        <w:t>125. Emblem — Aya's Cunning Treasure</w:t>
+        <w:t>125. 许攸</w:t>
       </w:r>
     </w:p>
     <w:p>
@@ -8750,7 +8782,7 @@
           <w:rFonts w:ascii="Microsoft YaHei" w:hAnsi="Microsoft YaHei" w:eastAsia="Microsoft YaHei"/>
           <w:sz w:val="20"/>
         </w:rPr>
-        <w:t>PH01 / 136</w:t>
+        <w:t>BT3K / 1</w:t>
       </w:r>
     </w:p>
     <w:p>
@@ -8767,7 +8799,7 @@
           <w:rFonts w:ascii="Microsoft YaHei" w:hAnsi="Microsoft YaHei" w:eastAsia="Microsoft YaHei"/>
           <w:sz w:val="20"/>
         </w:rPr>
-        <w:t>徽记</w:t>
+        <w:t>传奇生物～人类／参谋</w:t>
       </w:r>
     </w:p>
     <w:p>
@@ -8784,7 +8816,31 @@
           <w:rFonts w:ascii="Microsoft YaHei" w:hAnsi="Microsoft YaHei" w:eastAsia="Microsoft YaHei"/>
           <w:sz w:val="20"/>
         </w:rPr>
-        <w:t>每当你牺牲一个珍宝衍生物时，化生一张伪造的药水并置入你的手牌。</w:t>
+        <w:t>你改为从你的牌库底抓牌。你的对手可以略过其抓牌步骤，然后从你的牌库顶抓至多两张牌。</w:t>
+        <w:br/>
+      </w:r>
+      <w:r>
+        <w:rPr>
+          <w:rFonts w:ascii="Microsoft YaHei" w:hAnsi="Microsoft YaHei" w:eastAsia="Microsoft YaHei"/>
+          <w:sz w:val="20"/>
+        </w:rPr>
+        <w:t>每当你从手上施放一个瞬间或法术咒语时，于该咒语结算时，你可以改为将该牌置于你的牌库顶而非坟墓场。若你如此做，抓一张牌。每种类别至多触发一次。</w:t>
+        <w:br/>
+      </w:r>
+      <w:r>
+        <w:rPr>
+          <w:rFonts w:ascii="Microsoft YaHei" w:hAnsi="Microsoft YaHei" w:eastAsia="Microsoft YaHei"/>
+          <w:sz w:val="20"/>
+        </w:rPr>
+        <w:t>{T}：抓一张牌，然后弃两张牌并在许攸上放置一个转换指示物。</w:t>
+        <w:br/>
+      </w:r>
+      <w:r>
+        <w:rPr>
+          <w:rFonts w:ascii="Microsoft YaHei" w:hAnsi="Microsoft YaHei" w:eastAsia="Microsoft YaHei"/>
+          <w:sz w:val="20"/>
+        </w:rPr>
+        <w:t>{T}，从许攸上移去一个转换指示物：抓两张牌，然后弃一张牌。</w:t>
       </w:r>
     </w:p>
     <w:p>
@@ -8792,7 +8848,7 @@
         <w:pStyle w:val="Heading1"/>
       </w:pPr>
       <w:r>
-        <w:t>126. 亚西克瑞非体质</w:t>
+        <w:t>126. 神曹操</w:t>
       </w:r>
     </w:p>
     <w:p>
@@ -8809,7 +8865,7 @@
           <w:rFonts w:ascii="Microsoft YaHei" w:hAnsi="Microsoft YaHei" w:eastAsia="Microsoft YaHei"/>
           <w:sz w:val="20"/>
         </w:rPr>
-        <w:t>JF99 / 1</w:t>
+        <w:t>BT3K / 2</w:t>
       </w:r>
     </w:p>
     <w:p>
@@ -8826,7 +8882,7 @@
           <w:rFonts w:ascii="Microsoft YaHei" w:hAnsi="Microsoft YaHei" w:eastAsia="Microsoft YaHei"/>
           <w:sz w:val="20"/>
         </w:rPr>
-        <w:t>结界</w:t>
+        <w:t>传奇生物～人类／贵族</w:t>
       </w:r>
     </w:p>
     <w:p>
@@ -8843,7 +8899,7 @@
           <w:rFonts w:ascii="Microsoft YaHei" w:hAnsi="Microsoft YaHei" w:eastAsia="Microsoft YaHei"/>
           <w:sz w:val="20"/>
         </w:rPr>
-        <w:t>只要你的总生命为1或更多，你便不会输掉游戏，且你的对手不会赢得游戏。</w:t>
+        <w:t>抵受1。如果一个由对手操控的来源将对你造成伤害，除非该来源的操控者支付{1}，否则防止该伤害。</w:t>
         <w:br/>
       </w:r>
       <w:r>
@@ -8851,7 +8907,23 @@
           <w:rFonts w:ascii="Microsoft YaHei" w:hAnsi="Microsoft YaHei" w:eastAsia="Microsoft YaHei"/>
           <w:sz w:val="20"/>
         </w:rPr>
-        <w:t>只要你的每位指挥官的颜色标识均为无色，你可以于你能施放瞬间的时机，从你的牌库中展示此牌并将它放进战场。若你如此作，洗牌。每盘游戏只能如此作一次。</w:t>
+        <w:t>每当一个由对手操控的来源对你造成伤害时，该来源的操控者选择一项——</w:t>
+        <w:br/>
+      </w:r>
+      <w:r>
+        <w:rPr>
+          <w:rFonts w:ascii="Microsoft YaHei" w:hAnsi="Microsoft YaHei" w:eastAsia="Microsoft YaHei"/>
+          <w:sz w:val="20"/>
+        </w:rPr>
+        <w:t>• 选择一个由其操控的永久物。你获得该永久物的操控权。</w:t>
+        <w:br/>
+      </w:r>
+      <w:r>
+        <w:rPr>
+          <w:rFonts w:ascii="Microsoft YaHei" w:hAnsi="Microsoft YaHei" w:eastAsia="Microsoft YaHei"/>
+          <w:sz w:val="20"/>
+        </w:rPr>
+        <w:t>• 从其手牌放逐一张牌。</w:t>
       </w:r>
     </w:p>
     <w:p>
@@ -8859,7 +8931,7 @@
         <w:pStyle w:val="Heading1"/>
       </w:pPr>
       <w:r>
-        <w:t>127. 许攸</w:t>
+        <w:t>127. 魏武帝曹操</w:t>
       </w:r>
     </w:p>
     <w:p>
@@ -8876,7 +8948,7 @@
           <w:rFonts w:ascii="Microsoft YaHei" w:hAnsi="Microsoft YaHei" w:eastAsia="Microsoft YaHei"/>
           <w:sz w:val="20"/>
         </w:rPr>
-        <w:t>BT3K / 1</w:t>
+        <w:t>BT3K / 3</w:t>
       </w:r>
     </w:p>
     <w:p>
@@ -8893,7 +8965,7 @@
           <w:rFonts w:ascii="Microsoft YaHei" w:hAnsi="Microsoft YaHei" w:eastAsia="Microsoft YaHei"/>
           <w:sz w:val="20"/>
         </w:rPr>
-        <w:t>传奇生物～人类／参谋</w:t>
+        <w:t>传奇生物～人类／贵族</w:t>
       </w:r>
     </w:p>
     <w:p>
@@ -8910,7 +8982,7 @@
           <w:rFonts w:ascii="Microsoft YaHei" w:hAnsi="Microsoft YaHei" w:eastAsia="Microsoft YaHei"/>
           <w:sz w:val="20"/>
         </w:rPr>
-        <w:t>你改为从你的牌库底抓牌。你的对手可以略过其抓牌步骤，然后从你的牌库顶抓至多两张牌。</w:t>
+        <w:t>守护～弃两张牌。</w:t>
         <w:br/>
       </w:r>
       <w:r>
@@ -8918,7 +8990,7 @@
           <w:rFonts w:ascii="Microsoft YaHei" w:hAnsi="Microsoft YaHei" w:eastAsia="Microsoft YaHei"/>
           <w:sz w:val="20"/>
         </w:rPr>
-        <w:t>每当你从手上施放一个瞬间或法术咒语时，于该咒语结算时，你可以改为将该牌置于你的牌库顶而非坟墓场。若你如此做，抓一张牌。每种类别至多触发一次。</w:t>
+        <w:t>奸雄 — 如果一个不由你操控且本回合曾对你造成过伤害的瞬间或法术咒语将因结算而置入坟墓场，改为将它放逐。</w:t>
         <w:br/>
       </w:r>
       <w:r>
@@ -8926,15 +8998,7 @@
           <w:rFonts w:ascii="Microsoft YaHei" w:hAnsi="Microsoft YaHei" w:eastAsia="Microsoft YaHei"/>
           <w:sz w:val="20"/>
         </w:rPr>
-        <w:t>{T}：抓一张牌，然后弃两张牌并在许攸上放置一个转换指示物。</w:t>
-        <w:br/>
-      </w:r>
-      <w:r>
-        <w:rPr>
-          <w:rFonts w:ascii="Microsoft YaHei" w:hAnsi="Microsoft YaHei" w:eastAsia="Microsoft YaHei"/>
-          <w:sz w:val="20"/>
-        </w:rPr>
-        <w:t>{T}，从许攸上移去一个转换指示物：抓两张牌，然后弃一张牌。</w:t>
+        <w:t>于这些牌持续被放逐期间，你可以不支付其法术力费用来施放它们。</w:t>
       </w:r>
     </w:p>
     <w:p>
@@ -8942,7 +9006,7 @@
         <w:pStyle w:val="Heading1"/>
       </w:pPr>
       <w:r>
-        <w:t>128. 神曹操</w:t>
+        <w:t>128. 于吉</w:t>
       </w:r>
     </w:p>
     <w:p>
@@ -8959,7 +9023,7 @@
           <w:rFonts w:ascii="Microsoft YaHei" w:hAnsi="Microsoft YaHei" w:eastAsia="Microsoft YaHei"/>
           <w:sz w:val="20"/>
         </w:rPr>
-        <w:t>BT3K / 2</w:t>
+        <w:t>BT3K / 4</w:t>
       </w:r>
     </w:p>
     <w:p>
@@ -8976,7 +9040,7 @@
           <w:rFonts w:ascii="Microsoft YaHei" w:hAnsi="Microsoft YaHei" w:eastAsia="Microsoft YaHei"/>
           <w:sz w:val="20"/>
         </w:rPr>
-        <w:t>传奇生物～人类／贵族</w:t>
+        <w:t>传奇生物～人类／祭师</w:t>
       </w:r>
     </w:p>
     <w:p>
@@ -8993,7 +9057,7 @@
           <w:rFonts w:ascii="Microsoft YaHei" w:hAnsi="Microsoft YaHei" w:eastAsia="Microsoft YaHei"/>
           <w:sz w:val="20"/>
         </w:rPr>
-        <w:t>抵受1。如果一个由对手操控的来源将对你造成伤害，除非该来源的操控者支付{1}，否则防止该伤害。</w:t>
+        <w:t>每回合中，当你施放第一个名称不是于吉的咒语时，你可以选择一个牌名。每位对手可以选择质疑你。若有牌手如此作，展示你的手牌。若其中没有具该名称的牌，每位质疑你的牌手各从你手上选择一张牌并将其放逐；若其中有具该名称的牌，每位质疑你的牌手各获得一个具有「你不能质疑」的徽记。</w:t>
         <w:br/>
       </w:r>
       <w:r>
@@ -9001,23 +9065,7 @@
           <w:rFonts w:ascii="Microsoft YaHei" w:hAnsi="Microsoft YaHei" w:eastAsia="Microsoft YaHei"/>
           <w:sz w:val="20"/>
         </w:rPr>
-        <w:t>每当一个由对手操控的来源对你造成伤害时，该来源的操控者选择一项——</w:t>
-        <w:br/>
-      </w:r>
-      <w:r>
-        <w:rPr>
-          <w:rFonts w:ascii="Microsoft YaHei" w:hAnsi="Microsoft YaHei" w:eastAsia="Microsoft YaHei"/>
-          <w:sz w:val="20"/>
-        </w:rPr>
-        <w:t>• 选择一个由其操控的永久物。你获得该永久物的操控权。</w:t>
-        <w:br/>
-      </w:r>
-      <w:r>
-        <w:rPr>
-          <w:rFonts w:ascii="Microsoft YaHei" w:hAnsi="Microsoft YaHei" w:eastAsia="Microsoft YaHei"/>
-          <w:sz w:val="20"/>
-        </w:rPr>
-        <w:t>• 从其手牌放逐一张牌。</w:t>
+        <w:t>若无人质疑你，或质疑失败，你可以视同该咒语为具所选牌名的牌来施放，并支付该牌的法术力费用而非该咒语的法术力费用。</w:t>
       </w:r>
     </w:p>
     <w:p>
@@ -9025,7 +9073,7 @@
         <w:pStyle w:val="Heading1"/>
       </w:pPr>
       <w:r>
-        <w:t>129. 魏武帝曹操</w:t>
+        <w:t>129. 伪造的药水</w:t>
       </w:r>
     </w:p>
     <w:p>
@@ -9042,7 +9090,7 @@
           <w:rFonts w:ascii="Microsoft YaHei" w:hAnsi="Microsoft YaHei" w:eastAsia="Microsoft YaHei"/>
           <w:sz w:val="20"/>
         </w:rPr>
-        <w:t>BT3K / 3</w:t>
+        <w:t>TOKEN_HS / 2</w:t>
       </w:r>
     </w:p>
     <w:p>
@@ -9059,7 +9107,7 @@
           <w:rFonts w:ascii="Microsoft YaHei" w:hAnsi="Microsoft YaHei" w:eastAsia="Microsoft YaHei"/>
           <w:sz w:val="20"/>
         </w:rPr>
-        <w:t>传奇生物～人类／贵族</w:t>
+        <w:t>法术</w:t>
       </w:r>
     </w:p>
     <w:p>
@@ -9076,7 +9124,7 @@
           <w:rFonts w:ascii="Microsoft YaHei" w:hAnsi="Microsoft YaHei" w:eastAsia="Microsoft YaHei"/>
           <w:sz w:val="20"/>
         </w:rPr>
-        <w:t>守护～弃两张牌。</w:t>
+        <w:t>选择一项：</w:t>
         <w:br/>
       </w:r>
       <w:r>
@@ -9084,7 +9132,7 @@
           <w:rFonts w:ascii="Microsoft YaHei" w:hAnsi="Microsoft YaHei" w:eastAsia="Microsoft YaHei"/>
           <w:sz w:val="20"/>
         </w:rPr>
-        <w:t>奸雄 — 如果一个不由你操控且本回合曾对你造成过伤害的瞬间或法术咒语将因结算而置入坟墓场，改为将它放逐。</w:t>
+        <w:t>• 派出一个2/2的恶魔衍生生物。</w:t>
         <w:br/>
       </w:r>
       <w:r>
@@ -9092,7 +9140,63 @@
           <w:rFonts w:ascii="Microsoft YaHei" w:hAnsi="Microsoft YaHei" w:eastAsia="Microsoft YaHei"/>
           <w:sz w:val="20"/>
         </w:rPr>
-        <w:t>于这些牌持续被放逐期间，你可以不支付其法术力费用来施放它们。</w:t>
+        <w:t>• 发现一张恶魔牌。</w:t>
+        <w:br/>
+      </w:r>
+      <w:r>
+        <w:rPr>
+          <w:rFonts w:ascii="Microsoft YaHei" w:hAnsi="Microsoft YaHei" w:eastAsia="Microsoft YaHei"/>
+          <w:sz w:val="20"/>
+        </w:rPr>
+        <w:t>• 抓一张牌。</w:t>
+        <w:br/>
+      </w:r>
+      <w:r>
+        <w:rPr>
+          <w:rFonts w:ascii="Microsoft YaHei" w:hAnsi="Microsoft YaHei" w:eastAsia="Microsoft YaHei"/>
+          <w:sz w:val="20"/>
+        </w:rPr>
+        <w:t>• 伪造的药水对任一目标造成3点伤害。</w:t>
+        <w:br/>
+      </w:r>
+      <w:r>
+        <w:rPr>
+          <w:rFonts w:ascii="Microsoft YaHei" w:hAnsi="Microsoft YaHei" w:eastAsia="Microsoft YaHei"/>
+          <w:sz w:val="20"/>
+        </w:rPr>
+        <w:t>• 横置目标生物。它在其操控者的下个重置步骤中不能重置。</w:t>
+        <w:br/>
+      </w:r>
+      <w:r>
+        <w:rPr>
+          <w:rFonts w:ascii="Microsoft YaHei" w:hAnsi="Microsoft YaHei" w:eastAsia="Microsoft YaHei"/>
+          <w:sz w:val="20"/>
+        </w:rPr>
+        <w:t>• 你的每个生物永久得+0/+2。</w:t>
+        <w:br/>
+      </w:r>
+      <w:r>
+        <w:rPr>
+          <w:rFonts w:ascii="Microsoft YaHei" w:hAnsi="Microsoft YaHei" w:eastAsia="Microsoft YaHei"/>
+          <w:sz w:val="20"/>
+        </w:rPr>
+        <w:t>• 所有生物得-0/-2直到回合结束。</w:t>
+        <w:br/>
+      </w:r>
+      <w:r>
+        <w:rPr>
+          <w:rFonts w:ascii="Microsoft YaHei" w:hAnsi="Microsoft YaHei" w:eastAsia="Microsoft YaHei"/>
+          <w:sz w:val="20"/>
+        </w:rPr>
+        <w:t>• 随机将一个生物从你的坟墓场移回战场。</w:t>
+        <w:br/>
+      </w:r>
+      <w:r>
+        <w:rPr>
+          <w:rFonts w:ascii="Microsoft YaHei" w:hAnsi="Microsoft YaHei" w:eastAsia="Microsoft YaHei"/>
+          <w:sz w:val="20"/>
+        </w:rPr>
+        <w:t>• 获得4点生命。</w:t>
       </w:r>
     </w:p>
     <w:p>
@@ -9100,7 +9204,7 @@
         <w:pStyle w:val="Heading1"/>
       </w:pPr>
       <w:r>
-        <w:t>130. 于吉</w:t>
+        <w:t>130. Emblem — Aya's Jade Treasure</w:t>
       </w:r>
     </w:p>
     <w:p>
@@ -9117,7 +9221,7 @@
           <w:rFonts w:ascii="Microsoft YaHei" w:hAnsi="Microsoft YaHei" w:eastAsia="Microsoft YaHei"/>
           <w:sz w:val="20"/>
         </w:rPr>
-        <w:t>BT3K / 4</w:t>
+        <w:t>TOKEN_HS / 5</w:t>
       </w:r>
     </w:p>
     <w:p>
@@ -9134,7 +9238,7 @@
           <w:rFonts w:ascii="Microsoft YaHei" w:hAnsi="Microsoft YaHei" w:eastAsia="Microsoft YaHei"/>
           <w:sz w:val="20"/>
         </w:rPr>
-        <w:t>传奇生物～人类／祭师</w:t>
+        <w:t>徽记</w:t>
       </w:r>
     </w:p>
     <w:p>
@@ -9151,15 +9255,7 @@
           <w:rFonts w:ascii="Microsoft YaHei" w:hAnsi="Microsoft YaHei" w:eastAsia="Microsoft YaHei"/>
           <w:sz w:val="20"/>
         </w:rPr>
-        <w:t>每回合中，当你施放第一个名称不是于吉的咒语时，你可以选择一个牌名。每位对手可以选择质疑你。若有牌手如此作，展示你的手牌。若其中没有具该名称的牌，每位质疑你的牌手各从你手上选择一张牌并将其放逐；若其中有具该名称的牌，每位质疑你的牌手各获得一个具有「你不能质疑」的徽记。</w:t>
-        <w:br/>
-      </w:r>
-      <w:r>
-        <w:rPr>
-          <w:rFonts w:ascii="Microsoft YaHei" w:hAnsi="Microsoft YaHei" w:eastAsia="Microsoft YaHei"/>
-          <w:sz w:val="20"/>
-        </w:rPr>
-        <w:t>若无人质疑你，或质疑失败，你可以视同该咒语为具所选牌名的牌来施放，并支付该牌的法术力费用而非该咒语的法术力费用。</w:t>
+        <w:t>每当你牺牲一个珍宝衍生物时，派出一个青玉魔像。</w:t>
       </w:r>
     </w:p>
     <w:p>
@@ -9167,7 +9263,7 @@
         <w:pStyle w:val="Heading1"/>
       </w:pPr>
       <w:r>
-        <w:t>131. 伪造的药水</w:t>
+        <w:t>131. Emblem — Aya's Burst Treasure</w:t>
       </w:r>
     </w:p>
     <w:p>
@@ -9184,7 +9280,7 @@
           <w:rFonts w:ascii="Microsoft YaHei" w:hAnsi="Microsoft YaHei" w:eastAsia="Microsoft YaHei"/>
           <w:sz w:val="20"/>
         </w:rPr>
-        <w:t>TOKEN_HS / 2</w:t>
+        <w:t>TOKEN_HS / 6</w:t>
       </w:r>
     </w:p>
     <w:p>
@@ -9201,7 +9297,7 @@
           <w:rFonts w:ascii="Microsoft YaHei" w:hAnsi="Microsoft YaHei" w:eastAsia="Microsoft YaHei"/>
           <w:sz w:val="20"/>
         </w:rPr>
-        <w:t>法术</w:t>
+        <w:t>徽记</w:t>
       </w:r>
     </w:p>
     <w:p>
@@ -9218,79 +9314,66 @@
           <w:rFonts w:ascii="Microsoft YaHei" w:hAnsi="Microsoft YaHei" w:eastAsia="Microsoft YaHei"/>
           <w:sz w:val="20"/>
         </w:rPr>
-        <w:t>选择一项：</w:t>
-        <w:br/>
-      </w:r>
-      <w:r>
-        <w:rPr>
-          <w:rFonts w:ascii="Microsoft YaHei" w:hAnsi="Microsoft YaHei" w:eastAsia="Microsoft YaHei"/>
-          <w:sz w:val="20"/>
-        </w:rPr>
-        <w:t>• 派出一个2/2的恶魔衍生生物。</w:t>
-        <w:br/>
-      </w:r>
-      <w:r>
-        <w:rPr>
-          <w:rFonts w:ascii="Microsoft YaHei" w:hAnsi="Microsoft YaHei" w:eastAsia="Microsoft YaHei"/>
-          <w:sz w:val="20"/>
-        </w:rPr>
-        <w:t>• 发现一张恶魔牌。</w:t>
-        <w:br/>
-      </w:r>
-      <w:r>
-        <w:rPr>
-          <w:rFonts w:ascii="Microsoft YaHei" w:hAnsi="Microsoft YaHei" w:eastAsia="Microsoft YaHei"/>
-          <w:sz w:val="20"/>
-        </w:rPr>
-        <w:t>• 抓一张牌。</w:t>
-        <w:br/>
-      </w:r>
-      <w:r>
-        <w:rPr>
-          <w:rFonts w:ascii="Microsoft YaHei" w:hAnsi="Microsoft YaHei" w:eastAsia="Microsoft YaHei"/>
-          <w:sz w:val="20"/>
-        </w:rPr>
-        <w:t>• 伪造的药水对任一目标造成3点伤害。</w:t>
-        <w:br/>
-      </w:r>
-      <w:r>
-        <w:rPr>
-          <w:rFonts w:ascii="Microsoft YaHei" w:hAnsi="Microsoft YaHei" w:eastAsia="Microsoft YaHei"/>
-          <w:sz w:val="20"/>
-        </w:rPr>
-        <w:t>• 横置目标生物。它在其操控者的下个重置步骤中不能重置。</w:t>
-        <w:br/>
-      </w:r>
-      <w:r>
-        <w:rPr>
-          <w:rFonts w:ascii="Microsoft YaHei" w:hAnsi="Microsoft YaHei" w:eastAsia="Microsoft YaHei"/>
-          <w:sz w:val="20"/>
-        </w:rPr>
-        <w:t>• 你的每个生物永久得+0/+2。</w:t>
-        <w:br/>
-      </w:r>
-      <w:r>
-        <w:rPr>
-          <w:rFonts w:ascii="Microsoft YaHei" w:hAnsi="Microsoft YaHei" w:eastAsia="Microsoft YaHei"/>
-          <w:sz w:val="20"/>
-        </w:rPr>
-        <w:t>• 所有生物得-0/-2直到回合结束。</w:t>
-        <w:br/>
-      </w:r>
-      <w:r>
-        <w:rPr>
-          <w:rFonts w:ascii="Microsoft YaHei" w:hAnsi="Microsoft YaHei" w:eastAsia="Microsoft YaHei"/>
-          <w:sz w:val="20"/>
-        </w:rPr>
-        <w:t>• 随机将一个生物从你的坟墓场移回战场。</w:t>
-        <w:br/>
-      </w:r>
-      <w:r>
-        <w:rPr>
-          <w:rFonts w:ascii="Microsoft YaHei" w:hAnsi="Microsoft YaHei" w:eastAsia="Microsoft YaHei"/>
-          <w:sz w:val="20"/>
-        </w:rPr>
-        <w:t>• 获得4点生命。</w:t>
+        <w:t>每当你牺牲一个珍宝衍生物时，此徽记对一个随机选择的目标造成2点伤害，该目标须既不是你，也不是由你操控的永久物。</w:t>
+      </w:r>
+    </w:p>
+    <w:p>
+      <w:pPr>
+        <w:pStyle w:val="Heading1"/>
+      </w:pPr>
+      <w:r>
+        <w:t>132. Emblem — Aya's Cunning Treasure</w:t>
+      </w:r>
+    </w:p>
+    <w:p>
+      <w:r>
+        <w:rPr>
+          <w:rFonts w:ascii="Microsoft YaHei" w:hAnsi="Microsoft YaHei" w:eastAsia="Microsoft YaHei"/>
+          <w:b/>
+          <w:sz w:val="20"/>
+        </w:rPr>
+        <w:t>版本：</w:t>
+      </w:r>
+      <w:r>
+        <w:rPr>
+          <w:rFonts w:ascii="Microsoft YaHei" w:hAnsi="Microsoft YaHei" w:eastAsia="Microsoft YaHei"/>
+          <w:sz w:val="20"/>
+        </w:rPr>
+        <w:t>TOKEN_HS / 7</w:t>
+      </w:r>
+    </w:p>
+    <w:p>
+      <w:r>
+        <w:rPr>
+          <w:rFonts w:ascii="Microsoft YaHei" w:hAnsi="Microsoft YaHei" w:eastAsia="Microsoft YaHei"/>
+          <w:b/>
+          <w:sz w:val="20"/>
+        </w:rPr>
+        <w:t>类别：</w:t>
+      </w:r>
+      <w:r>
+        <w:rPr>
+          <w:rFonts w:ascii="Microsoft YaHei" w:hAnsi="Microsoft YaHei" w:eastAsia="Microsoft YaHei"/>
+          <w:sz w:val="20"/>
+        </w:rPr>
+        <w:t>徽记</w:t>
+      </w:r>
+    </w:p>
+    <w:p>
+      <w:r>
+        <w:rPr>
+          <w:rFonts w:ascii="Microsoft YaHei" w:hAnsi="Microsoft YaHei" w:eastAsia="Microsoft YaHei"/>
+          <w:b/>
+          <w:sz w:val="20"/>
+        </w:rPr>
+        <w:t>Oracle：</w:t>
+      </w:r>
+      <w:r>
+        <w:rPr>
+          <w:rFonts w:ascii="Microsoft YaHei" w:hAnsi="Microsoft YaHei" w:eastAsia="Microsoft YaHei"/>
+          <w:sz w:val="20"/>
+        </w:rPr>
+        <w:t>每当你牺牲一个珍宝衍生物时，化生一张伪造的药水并置入你的手牌。</w:t>
       </w:r>
     </w:p>
     <w:sectPr>

</xml_diff>

<commit_message>
Restore Pilot Patches and Parachute artwork
</commit_message>
<xml_diff>
--- a/custom/DIY卡牌_游戏内Oracle_非测试卡.docx
+++ b/custom/DIY卡牌_游戏内Oracle_非测试卡.docx
@@ -17,7 +17,7 @@
     </w:p>
     <w:p>
       <w:r>
-        <w:t>已隐藏 Gigantic Spright；当前共 132 张非测试 DIY 卡。本次 wording 审校 122 张，未改动 10 张炉石泰坦卡牌。</w:t>
+        <w:t>已隐藏 Gigantic Spright；当前共 134 张非测试 DIY 卡。本次 wording 审校 124 张，未改动 10 张炉石泰坦卡牌。</w:t>
       </w:r>
     </w:p>
     <w:p>
@@ -8623,7 +8623,7 @@
         <w:pStyle w:val="Heading1"/>
       </w:pPr>
       <w:r>
-        <w:t>123. 玩具船</w:t>
+        <w:t>123. 飞行员帕奇斯</w:t>
       </w:r>
     </w:p>
     <w:p>
@@ -8640,7 +8640,7 @@
           <w:rFonts w:ascii="Microsoft YaHei" w:hAnsi="Microsoft YaHei" w:eastAsia="Microsoft YaHei"/>
           <w:sz w:val="20"/>
         </w:rPr>
-        <w:t>PH01 / 137</w:t>
+        <w:t>PH01 / 134</w:t>
       </w:r>
     </w:p>
     <w:p>
@@ -8657,7 +8657,7 @@
           <w:rFonts w:ascii="Microsoft YaHei" w:hAnsi="Microsoft YaHei" w:eastAsia="Microsoft YaHei"/>
           <w:sz w:val="20"/>
         </w:rPr>
-        <w:t>神器生物～船</w:t>
+        <w:t>生物～海盗</w:t>
       </w:r>
     </w:p>
     <w:p>
@@ -8674,7 +8674,7 @@
           <w:rFonts w:ascii="Microsoft YaHei" w:hAnsi="Microsoft YaHei" w:eastAsia="Microsoft YaHei"/>
           <w:sz w:val="20"/>
         </w:rPr>
-        <w:t>守军</w:t>
+        <w:t>你的起始套牌中不能含有多于一张名为飞行员帕奇斯的牌。</w:t>
         <w:br/>
       </w:r>
       <w:r>
@@ -8682,7 +8682,7 @@
           <w:rFonts w:ascii="Microsoft YaHei" w:hAnsi="Microsoft YaHei" w:eastAsia="Microsoft YaHei"/>
           <w:sz w:val="20"/>
         </w:rPr>
-        <w:t>只要玩具船可以阻挡，则它必须阻挡。</w:t>
+        <w:t>飞行</w:t>
         <w:br/>
       </w:r>
       <w:r>
@@ -8690,7 +8690,7 @@
           <w:rFonts w:ascii="Microsoft YaHei" w:hAnsi="Microsoft YaHei" w:eastAsia="Microsoft YaHei"/>
           <w:sz w:val="20"/>
         </w:rPr>
-        <w:t>每当你召唤一个海盗时，抓一张牌。</w:t>
+        <w:t>当飞行员帕奇斯进战场时，化生六张帕奇斯的降落伞到你的牌库，然后将你的牌库洗牌。</w:t>
       </w:r>
     </w:p>
     <w:p>
@@ -8698,7 +8698,7 @@
         <w:pStyle w:val="Heading1"/>
       </w:pPr>
       <w:r>
-        <w:t>124. 亚西克瑞非体质</w:t>
+        <w:t>124. 玩具船</w:t>
       </w:r>
     </w:p>
     <w:p>
@@ -8715,7 +8715,7 @@
           <w:rFonts w:ascii="Microsoft YaHei" w:hAnsi="Microsoft YaHei" w:eastAsia="Microsoft YaHei"/>
           <w:sz w:val="20"/>
         </w:rPr>
-        <w:t>JF99 / 1</w:t>
+        <w:t>PH01 / 137</w:t>
       </w:r>
     </w:p>
     <w:p>
@@ -8732,7 +8732,7 @@
           <w:rFonts w:ascii="Microsoft YaHei" w:hAnsi="Microsoft YaHei" w:eastAsia="Microsoft YaHei"/>
           <w:sz w:val="20"/>
         </w:rPr>
-        <w:t>结界</w:t>
+        <w:t>神器生物～船</w:t>
       </w:r>
     </w:p>
     <w:p>
@@ -8749,7 +8749,7 @@
           <w:rFonts w:ascii="Microsoft YaHei" w:hAnsi="Microsoft YaHei" w:eastAsia="Microsoft YaHei"/>
           <w:sz w:val="20"/>
         </w:rPr>
-        <w:t>只要你的总生命为1或更多，你便不会输掉游戏，且你的对手不会赢得游戏。</w:t>
+        <w:t>守军</w:t>
         <w:br/>
       </w:r>
       <w:r>
@@ -8757,7 +8757,15 @@
           <w:rFonts w:ascii="Microsoft YaHei" w:hAnsi="Microsoft YaHei" w:eastAsia="Microsoft YaHei"/>
           <w:sz w:val="20"/>
         </w:rPr>
-        <w:t>只要你的每位指挥官的颜色标识均为无色，你可以于你能施放瞬间的时机，从你的牌库中展示此牌并将它放进战场。若你如此作，洗牌。每盘游戏只能如此作一次。</w:t>
+        <w:t>只要玩具船可以阻挡，则它必须阻挡。</w:t>
+        <w:br/>
+      </w:r>
+      <w:r>
+        <w:rPr>
+          <w:rFonts w:ascii="Microsoft YaHei" w:hAnsi="Microsoft YaHei" w:eastAsia="Microsoft YaHei"/>
+          <w:sz w:val="20"/>
+        </w:rPr>
+        <w:t>每当你召唤一个海盗时，抓一张牌。</w:t>
       </w:r>
     </w:p>
     <w:p>
@@ -8765,7 +8773,7 @@
         <w:pStyle w:val="Heading1"/>
       </w:pPr>
       <w:r>
-        <w:t>125. 许攸</w:t>
+        <w:t>125. 亚西克瑞非体质</w:t>
       </w:r>
     </w:p>
     <w:p>
@@ -8782,7 +8790,7 @@
           <w:rFonts w:ascii="Microsoft YaHei" w:hAnsi="Microsoft YaHei" w:eastAsia="Microsoft YaHei"/>
           <w:sz w:val="20"/>
         </w:rPr>
-        <w:t>BT3K / 1</w:t>
+        <w:t>JF99 / 1</w:t>
       </w:r>
     </w:p>
     <w:p>
@@ -8799,7 +8807,7 @@
           <w:rFonts w:ascii="Microsoft YaHei" w:hAnsi="Microsoft YaHei" w:eastAsia="Microsoft YaHei"/>
           <w:sz w:val="20"/>
         </w:rPr>
-        <w:t>传奇生物～人类／参谋</w:t>
+        <w:t>结界</w:t>
       </w:r>
     </w:p>
     <w:p>
@@ -8816,7 +8824,7 @@
           <w:rFonts w:ascii="Microsoft YaHei" w:hAnsi="Microsoft YaHei" w:eastAsia="Microsoft YaHei"/>
           <w:sz w:val="20"/>
         </w:rPr>
-        <w:t>你改为从你的牌库底抓牌。你的对手可以略过其抓牌步骤，然后从你的牌库顶抓至多两张牌。</w:t>
+        <w:t>只要你的总生命为1或更多，你便不会输掉游戏，且你的对手不会赢得游戏。</w:t>
         <w:br/>
       </w:r>
       <w:r>
@@ -8824,23 +8832,7 @@
           <w:rFonts w:ascii="Microsoft YaHei" w:hAnsi="Microsoft YaHei" w:eastAsia="Microsoft YaHei"/>
           <w:sz w:val="20"/>
         </w:rPr>
-        <w:t>每当你从手上施放一个瞬间或法术咒语时，于该咒语结算时，你可以改为将该牌置于你的牌库顶而非坟墓场。若你如此做，抓一张牌。每种类别至多触发一次。</w:t>
-        <w:br/>
-      </w:r>
-      <w:r>
-        <w:rPr>
-          <w:rFonts w:ascii="Microsoft YaHei" w:hAnsi="Microsoft YaHei" w:eastAsia="Microsoft YaHei"/>
-          <w:sz w:val="20"/>
-        </w:rPr>
-        <w:t>{T}：抓一张牌，然后弃两张牌并在许攸上放置一个转换指示物。</w:t>
-        <w:br/>
-      </w:r>
-      <w:r>
-        <w:rPr>
-          <w:rFonts w:ascii="Microsoft YaHei" w:hAnsi="Microsoft YaHei" w:eastAsia="Microsoft YaHei"/>
-          <w:sz w:val="20"/>
-        </w:rPr>
-        <w:t>{T}，从许攸上移去一个转换指示物：抓两张牌，然后弃一张牌。</w:t>
+        <w:t>只要你的每位指挥官的颜色标识均为无色，你可以于你能施放瞬间的时机，从你的牌库中展示此牌并将它放进战场。若你如此作，洗牌。每盘游戏只能如此作一次。</w:t>
       </w:r>
     </w:p>
     <w:p>
@@ -8848,7 +8840,7 @@
         <w:pStyle w:val="Heading1"/>
       </w:pPr>
       <w:r>
-        <w:t>126. 神曹操</w:t>
+        <w:t>126. 许攸</w:t>
       </w:r>
     </w:p>
     <w:p>
@@ -8865,7 +8857,7 @@
           <w:rFonts w:ascii="Microsoft YaHei" w:hAnsi="Microsoft YaHei" w:eastAsia="Microsoft YaHei"/>
           <w:sz w:val="20"/>
         </w:rPr>
-        <w:t>BT3K / 2</w:t>
+        <w:t>BT3K / 1</w:t>
       </w:r>
     </w:p>
     <w:p>
@@ -8882,7 +8874,7 @@
           <w:rFonts w:ascii="Microsoft YaHei" w:hAnsi="Microsoft YaHei" w:eastAsia="Microsoft YaHei"/>
           <w:sz w:val="20"/>
         </w:rPr>
-        <w:t>传奇生物～人类／贵族</w:t>
+        <w:t>传奇生物～人类／参谋</w:t>
       </w:r>
     </w:p>
     <w:p>
@@ -8899,7 +8891,7 @@
           <w:rFonts w:ascii="Microsoft YaHei" w:hAnsi="Microsoft YaHei" w:eastAsia="Microsoft YaHei"/>
           <w:sz w:val="20"/>
         </w:rPr>
-        <w:t>抵受1。如果一个由对手操控的来源将对你造成伤害，除非该来源的操控者支付{1}，否则防止该伤害。</w:t>
+        <w:t>你改为从你的牌库底抓牌。你的对手可以略过其抓牌步骤，然后从你的牌库顶抓至多两张牌。</w:t>
         <w:br/>
       </w:r>
       <w:r>
@@ -8907,7 +8899,7 @@
           <w:rFonts w:ascii="Microsoft YaHei" w:hAnsi="Microsoft YaHei" w:eastAsia="Microsoft YaHei"/>
           <w:sz w:val="20"/>
         </w:rPr>
-        <w:t>每当一个由对手操控的来源对你造成伤害时，该来源的操控者选择一项——</w:t>
+        <w:t>每当你从手上施放一个瞬间或法术咒语时，于该咒语结算时，你可以改为将该牌置于你的牌库顶而非坟墓场。若你如此做，抓一张牌。每种类别至多触发一次。</w:t>
         <w:br/>
       </w:r>
       <w:r>
@@ -8915,7 +8907,7 @@
           <w:rFonts w:ascii="Microsoft YaHei" w:hAnsi="Microsoft YaHei" w:eastAsia="Microsoft YaHei"/>
           <w:sz w:val="20"/>
         </w:rPr>
-        <w:t>• 选择一个由其操控的永久物。你获得该永久物的操控权。</w:t>
+        <w:t>{T}：抓一张牌，然后弃两张牌并在许攸上放置一个转换指示物。</w:t>
         <w:br/>
       </w:r>
       <w:r>
@@ -8923,7 +8915,7 @@
           <w:rFonts w:ascii="Microsoft YaHei" w:hAnsi="Microsoft YaHei" w:eastAsia="Microsoft YaHei"/>
           <w:sz w:val="20"/>
         </w:rPr>
-        <w:t>• 从其手牌放逐一张牌。</w:t>
+        <w:t>{T}，从许攸上移去一个转换指示物：抓两张牌，然后弃一张牌。</w:t>
       </w:r>
     </w:p>
     <w:p>
@@ -8931,7 +8923,7 @@
         <w:pStyle w:val="Heading1"/>
       </w:pPr>
       <w:r>
-        <w:t>127. 魏武帝曹操</w:t>
+        <w:t>127. 神曹操</w:t>
       </w:r>
     </w:p>
     <w:p>
@@ -8948,7 +8940,7 @@
           <w:rFonts w:ascii="Microsoft YaHei" w:hAnsi="Microsoft YaHei" w:eastAsia="Microsoft YaHei"/>
           <w:sz w:val="20"/>
         </w:rPr>
-        <w:t>BT3K / 3</w:t>
+        <w:t>BT3K / 2</w:t>
       </w:r>
     </w:p>
     <w:p>
@@ -8982,7 +8974,7 @@
           <w:rFonts w:ascii="Microsoft YaHei" w:hAnsi="Microsoft YaHei" w:eastAsia="Microsoft YaHei"/>
           <w:sz w:val="20"/>
         </w:rPr>
-        <w:t>守护～弃两张牌。</w:t>
+        <w:t>抵受1。如果一个由对手操控的来源将对你造成伤害，除非该来源的操控者支付{1}，否则防止该伤害。</w:t>
         <w:br/>
       </w:r>
       <w:r>
@@ -8990,7 +8982,7 @@
           <w:rFonts w:ascii="Microsoft YaHei" w:hAnsi="Microsoft YaHei" w:eastAsia="Microsoft YaHei"/>
           <w:sz w:val="20"/>
         </w:rPr>
-        <w:t>奸雄 — 如果一个不由你操控且本回合曾对你造成过伤害的瞬间或法术咒语将因结算而置入坟墓场，改为将它放逐。</w:t>
+        <w:t>每当一个由对手操控的来源对你造成伤害时，该来源的操控者选择一项——</w:t>
         <w:br/>
       </w:r>
       <w:r>
@@ -8998,7 +8990,15 @@
           <w:rFonts w:ascii="Microsoft YaHei" w:hAnsi="Microsoft YaHei" w:eastAsia="Microsoft YaHei"/>
           <w:sz w:val="20"/>
         </w:rPr>
-        <w:t>于这些牌持续被放逐期间，你可以不支付其法术力费用来施放它们。</w:t>
+        <w:t>• 选择一个由其操控的永久物。你获得该永久物的操控权。</w:t>
+        <w:br/>
+      </w:r>
+      <w:r>
+        <w:rPr>
+          <w:rFonts w:ascii="Microsoft YaHei" w:hAnsi="Microsoft YaHei" w:eastAsia="Microsoft YaHei"/>
+          <w:sz w:val="20"/>
+        </w:rPr>
+        <w:t>• 从其手牌放逐一张牌。</w:t>
       </w:r>
     </w:p>
     <w:p>
@@ -9006,7 +9006,7 @@
         <w:pStyle w:val="Heading1"/>
       </w:pPr>
       <w:r>
-        <w:t>128. 于吉</w:t>
+        <w:t>128. 魏武帝曹操</w:t>
       </w:r>
     </w:p>
     <w:p>
@@ -9023,7 +9023,7 @@
           <w:rFonts w:ascii="Microsoft YaHei" w:hAnsi="Microsoft YaHei" w:eastAsia="Microsoft YaHei"/>
           <w:sz w:val="20"/>
         </w:rPr>
-        <w:t>BT3K / 4</w:t>
+        <w:t>BT3K / 3</w:t>
       </w:r>
     </w:p>
     <w:p>
@@ -9040,7 +9040,7 @@
           <w:rFonts w:ascii="Microsoft YaHei" w:hAnsi="Microsoft YaHei" w:eastAsia="Microsoft YaHei"/>
           <w:sz w:val="20"/>
         </w:rPr>
-        <w:t>传奇生物～人类／祭师</w:t>
+        <w:t>传奇生物～人类／贵族</w:t>
       </w:r>
     </w:p>
     <w:p>
@@ -9057,7 +9057,7 @@
           <w:rFonts w:ascii="Microsoft YaHei" w:hAnsi="Microsoft YaHei" w:eastAsia="Microsoft YaHei"/>
           <w:sz w:val="20"/>
         </w:rPr>
-        <w:t>每回合中，当你施放第一个名称不是于吉的咒语时，你可以选择一个牌名。每位对手可以选择质疑你。若有牌手如此作，展示你的手牌。若其中没有具该名称的牌，每位质疑你的牌手各从你手上选择一张牌并将其放逐；若其中有具该名称的牌，每位质疑你的牌手各获得一个具有「你不能质疑」的徽记。</w:t>
+        <w:t>守护～弃两张牌。</w:t>
         <w:br/>
       </w:r>
       <w:r>
@@ -9065,7 +9065,15 @@
           <w:rFonts w:ascii="Microsoft YaHei" w:hAnsi="Microsoft YaHei" w:eastAsia="Microsoft YaHei"/>
           <w:sz w:val="20"/>
         </w:rPr>
-        <w:t>若无人质疑你，或质疑失败，你可以视同该咒语为具所选牌名的牌来施放，并支付该牌的法术力费用而非该咒语的法术力费用。</w:t>
+        <w:t>奸雄 — 如果一个不由你操控且本回合曾对你造成过伤害的瞬间或法术咒语将因结算而置入坟墓场，改为将它放逐。</w:t>
+        <w:br/>
+      </w:r>
+      <w:r>
+        <w:rPr>
+          <w:rFonts w:ascii="Microsoft YaHei" w:hAnsi="Microsoft YaHei" w:eastAsia="Microsoft YaHei"/>
+          <w:sz w:val="20"/>
+        </w:rPr>
+        <w:t>于这些牌持续被放逐期间，你可以不支付其法术力费用来施放它们。</w:t>
       </w:r>
     </w:p>
     <w:p>
@@ -9073,7 +9081,7 @@
         <w:pStyle w:val="Heading1"/>
       </w:pPr>
       <w:r>
-        <w:t>129. 伪造的药水</w:t>
+        <w:t>129. 于吉</w:t>
       </w:r>
     </w:p>
     <w:p>
@@ -9090,7 +9098,7 @@
           <w:rFonts w:ascii="Microsoft YaHei" w:hAnsi="Microsoft YaHei" w:eastAsia="Microsoft YaHei"/>
           <w:sz w:val="20"/>
         </w:rPr>
-        <w:t>TOKEN_HS / 2</w:t>
+        <w:t>BT3K / 4</w:t>
       </w:r>
     </w:p>
     <w:p>
@@ -9107,7 +9115,7 @@
           <w:rFonts w:ascii="Microsoft YaHei" w:hAnsi="Microsoft YaHei" w:eastAsia="Microsoft YaHei"/>
           <w:sz w:val="20"/>
         </w:rPr>
-        <w:t>法术</w:t>
+        <w:t>传奇生物～人类／祭师</w:t>
       </w:r>
     </w:p>
     <w:p>
@@ -9124,7 +9132,7 @@
           <w:rFonts w:ascii="Microsoft YaHei" w:hAnsi="Microsoft YaHei" w:eastAsia="Microsoft YaHei"/>
           <w:sz w:val="20"/>
         </w:rPr>
-        <w:t>选择一项：</w:t>
+        <w:t>每回合中，当你施放第一个名称不是于吉的咒语时，你可以选择一个牌名。每位对手可以选择质疑你。若有牌手如此作，展示你的手牌。若其中没有具该名称的牌，每位质疑你的牌手各从你手上选择一张牌并将其放逐；若其中有具该名称的牌，每位质疑你的牌手各获得一个具有「你不能质疑」的徽记。</w:t>
         <w:br/>
       </w:r>
       <w:r>
@@ -9132,71 +9140,7 @@
           <w:rFonts w:ascii="Microsoft YaHei" w:hAnsi="Microsoft YaHei" w:eastAsia="Microsoft YaHei"/>
           <w:sz w:val="20"/>
         </w:rPr>
-        <w:t>• 派出一个2/2的恶魔衍生生物。</w:t>
-        <w:br/>
-      </w:r>
-      <w:r>
-        <w:rPr>
-          <w:rFonts w:ascii="Microsoft YaHei" w:hAnsi="Microsoft YaHei" w:eastAsia="Microsoft YaHei"/>
-          <w:sz w:val="20"/>
-        </w:rPr>
-        <w:t>• 发现一张恶魔牌。</w:t>
-        <w:br/>
-      </w:r>
-      <w:r>
-        <w:rPr>
-          <w:rFonts w:ascii="Microsoft YaHei" w:hAnsi="Microsoft YaHei" w:eastAsia="Microsoft YaHei"/>
-          <w:sz w:val="20"/>
-        </w:rPr>
-        <w:t>• 抓一张牌。</w:t>
-        <w:br/>
-      </w:r>
-      <w:r>
-        <w:rPr>
-          <w:rFonts w:ascii="Microsoft YaHei" w:hAnsi="Microsoft YaHei" w:eastAsia="Microsoft YaHei"/>
-          <w:sz w:val="20"/>
-        </w:rPr>
-        <w:t>• 伪造的药水对任一目标造成3点伤害。</w:t>
-        <w:br/>
-      </w:r>
-      <w:r>
-        <w:rPr>
-          <w:rFonts w:ascii="Microsoft YaHei" w:hAnsi="Microsoft YaHei" w:eastAsia="Microsoft YaHei"/>
-          <w:sz w:val="20"/>
-        </w:rPr>
-        <w:t>• 横置目标生物。它在其操控者的下个重置步骤中不能重置。</w:t>
-        <w:br/>
-      </w:r>
-      <w:r>
-        <w:rPr>
-          <w:rFonts w:ascii="Microsoft YaHei" w:hAnsi="Microsoft YaHei" w:eastAsia="Microsoft YaHei"/>
-          <w:sz w:val="20"/>
-        </w:rPr>
-        <w:t>• 你的每个生物永久得+0/+2。</w:t>
-        <w:br/>
-      </w:r>
-      <w:r>
-        <w:rPr>
-          <w:rFonts w:ascii="Microsoft YaHei" w:hAnsi="Microsoft YaHei" w:eastAsia="Microsoft YaHei"/>
-          <w:sz w:val="20"/>
-        </w:rPr>
-        <w:t>• 所有生物得-0/-2直到回合结束。</w:t>
-        <w:br/>
-      </w:r>
-      <w:r>
-        <w:rPr>
-          <w:rFonts w:ascii="Microsoft YaHei" w:hAnsi="Microsoft YaHei" w:eastAsia="Microsoft YaHei"/>
-          <w:sz w:val="20"/>
-        </w:rPr>
-        <w:t>• 随机将一个生物从你的坟墓场移回战场。</w:t>
-        <w:br/>
-      </w:r>
-      <w:r>
-        <w:rPr>
-          <w:rFonts w:ascii="Microsoft YaHei" w:hAnsi="Microsoft YaHei" w:eastAsia="Microsoft YaHei"/>
-          <w:sz w:val="20"/>
-        </w:rPr>
-        <w:t>• 获得4点生命。</w:t>
+        <w:t>若无人质疑你，或质疑失败，你可以视同该咒语为具所选牌名的牌来施放，并支付该牌的法术力费用而非该咒语的法术力费用。</w:t>
       </w:r>
     </w:p>
     <w:p>
@@ -9204,7 +9148,7 @@
         <w:pStyle w:val="Heading1"/>
       </w:pPr>
       <w:r>
-        <w:t>130. Emblem — Aya's Jade Treasure</w:t>
+        <w:t>130. 伪造的药水</w:t>
       </w:r>
     </w:p>
     <w:p>
@@ -9221,7 +9165,7 @@
           <w:rFonts w:ascii="Microsoft YaHei" w:hAnsi="Microsoft YaHei" w:eastAsia="Microsoft YaHei"/>
           <w:sz w:val="20"/>
         </w:rPr>
-        <w:t>TOKEN_HS / 5</w:t>
+        <w:t>TOKEN_HS / 2</w:t>
       </w:r>
     </w:p>
     <w:p>
@@ -9238,7 +9182,7 @@
           <w:rFonts w:ascii="Microsoft YaHei" w:hAnsi="Microsoft YaHei" w:eastAsia="Microsoft YaHei"/>
           <w:sz w:val="20"/>
         </w:rPr>
-        <w:t>徽记</w:t>
+        <w:t>法术</w:t>
       </w:r>
     </w:p>
     <w:p>
@@ -9255,7 +9199,79 @@
           <w:rFonts w:ascii="Microsoft YaHei" w:hAnsi="Microsoft YaHei" w:eastAsia="Microsoft YaHei"/>
           <w:sz w:val="20"/>
         </w:rPr>
-        <w:t>每当你牺牲一个珍宝衍生物时，派出一个青玉魔像。</w:t>
+        <w:t>选择一项：</w:t>
+        <w:br/>
+      </w:r>
+      <w:r>
+        <w:rPr>
+          <w:rFonts w:ascii="Microsoft YaHei" w:hAnsi="Microsoft YaHei" w:eastAsia="Microsoft YaHei"/>
+          <w:sz w:val="20"/>
+        </w:rPr>
+        <w:t>• 派出一个2/2的恶魔衍生生物。</w:t>
+        <w:br/>
+      </w:r>
+      <w:r>
+        <w:rPr>
+          <w:rFonts w:ascii="Microsoft YaHei" w:hAnsi="Microsoft YaHei" w:eastAsia="Microsoft YaHei"/>
+          <w:sz w:val="20"/>
+        </w:rPr>
+        <w:t>• 发现一张恶魔牌。</w:t>
+        <w:br/>
+      </w:r>
+      <w:r>
+        <w:rPr>
+          <w:rFonts w:ascii="Microsoft YaHei" w:hAnsi="Microsoft YaHei" w:eastAsia="Microsoft YaHei"/>
+          <w:sz w:val="20"/>
+        </w:rPr>
+        <w:t>• 抓一张牌。</w:t>
+        <w:br/>
+      </w:r>
+      <w:r>
+        <w:rPr>
+          <w:rFonts w:ascii="Microsoft YaHei" w:hAnsi="Microsoft YaHei" w:eastAsia="Microsoft YaHei"/>
+          <w:sz w:val="20"/>
+        </w:rPr>
+        <w:t>• 伪造的药水对任一目标造成3点伤害。</w:t>
+        <w:br/>
+      </w:r>
+      <w:r>
+        <w:rPr>
+          <w:rFonts w:ascii="Microsoft YaHei" w:hAnsi="Microsoft YaHei" w:eastAsia="Microsoft YaHei"/>
+          <w:sz w:val="20"/>
+        </w:rPr>
+        <w:t>• 横置目标生物。它在其操控者的下个重置步骤中不能重置。</w:t>
+        <w:br/>
+      </w:r>
+      <w:r>
+        <w:rPr>
+          <w:rFonts w:ascii="Microsoft YaHei" w:hAnsi="Microsoft YaHei" w:eastAsia="Microsoft YaHei"/>
+          <w:sz w:val="20"/>
+        </w:rPr>
+        <w:t>• 你的每个生物永久得+0/+2。</w:t>
+        <w:br/>
+      </w:r>
+      <w:r>
+        <w:rPr>
+          <w:rFonts w:ascii="Microsoft YaHei" w:hAnsi="Microsoft YaHei" w:eastAsia="Microsoft YaHei"/>
+          <w:sz w:val="20"/>
+        </w:rPr>
+        <w:t>• 所有生物得-0/-2直到回合结束。</w:t>
+        <w:br/>
+      </w:r>
+      <w:r>
+        <w:rPr>
+          <w:rFonts w:ascii="Microsoft YaHei" w:hAnsi="Microsoft YaHei" w:eastAsia="Microsoft YaHei"/>
+          <w:sz w:val="20"/>
+        </w:rPr>
+        <w:t>• 随机将一个生物从你的坟墓场移回战场。</w:t>
+        <w:br/>
+      </w:r>
+      <w:r>
+        <w:rPr>
+          <w:rFonts w:ascii="Microsoft YaHei" w:hAnsi="Microsoft YaHei" w:eastAsia="Microsoft YaHei"/>
+          <w:sz w:val="20"/>
+        </w:rPr>
+        <w:t>• 获得4点生命。</w:t>
       </w:r>
     </w:p>
     <w:p>
@@ -9263,7 +9279,7 @@
         <w:pStyle w:val="Heading1"/>
       </w:pPr>
       <w:r>
-        <w:t>131. Emblem — Aya's Burst Treasure</w:t>
+        <w:t>131. 帕奇斯的降落伞</w:t>
       </w:r>
     </w:p>
     <w:p>
@@ -9280,7 +9296,7 @@
           <w:rFonts w:ascii="Microsoft YaHei" w:hAnsi="Microsoft YaHei" w:eastAsia="Microsoft YaHei"/>
           <w:sz w:val="20"/>
         </w:rPr>
-        <w:t>TOKEN_HS / 6</w:t>
+        <w:t>TOKEN_HS / 4</w:t>
       </w:r>
     </w:p>
     <w:p>
@@ -9297,7 +9313,7 @@
           <w:rFonts w:ascii="Microsoft YaHei" w:hAnsi="Microsoft YaHei" w:eastAsia="Microsoft YaHei"/>
           <w:sz w:val="20"/>
         </w:rPr>
-        <w:t>徽记</w:t>
+        <w:t>瞬间</w:t>
       </w:r>
     </w:p>
     <w:p>
@@ -9314,7 +9330,7 @@
           <w:rFonts w:ascii="Microsoft YaHei" w:hAnsi="Microsoft YaHei" w:eastAsia="Microsoft YaHei"/>
           <w:sz w:val="20"/>
         </w:rPr>
-        <w:t>每当你牺牲一个珍宝衍生物时，此徽记对一个随机选择的目标造成2点伤害，该目标须既不是你，也不是由你操控的永久物。</w:t>
+        <w:t>派出一个1/1并具有敏捷的海盗衍生生物，然后抓一张牌。</w:t>
       </w:r>
     </w:p>
     <w:p>
@@ -9322,7 +9338,125 @@
         <w:pStyle w:val="Heading1"/>
       </w:pPr>
       <w:r>
-        <w:t>132. Emblem — Aya's Cunning Treasure</w:t>
+        <w:t>132. Emblem — Aya's Jade Treasure</w:t>
+      </w:r>
+    </w:p>
+    <w:p>
+      <w:r>
+        <w:rPr>
+          <w:rFonts w:ascii="Microsoft YaHei" w:hAnsi="Microsoft YaHei" w:eastAsia="Microsoft YaHei"/>
+          <w:b/>
+          <w:sz w:val="20"/>
+        </w:rPr>
+        <w:t>版本：</w:t>
+      </w:r>
+      <w:r>
+        <w:rPr>
+          <w:rFonts w:ascii="Microsoft YaHei" w:hAnsi="Microsoft YaHei" w:eastAsia="Microsoft YaHei"/>
+          <w:sz w:val="20"/>
+        </w:rPr>
+        <w:t>TOKEN_HS / 5</w:t>
+      </w:r>
+    </w:p>
+    <w:p>
+      <w:r>
+        <w:rPr>
+          <w:rFonts w:ascii="Microsoft YaHei" w:hAnsi="Microsoft YaHei" w:eastAsia="Microsoft YaHei"/>
+          <w:b/>
+          <w:sz w:val="20"/>
+        </w:rPr>
+        <w:t>类别：</w:t>
+      </w:r>
+      <w:r>
+        <w:rPr>
+          <w:rFonts w:ascii="Microsoft YaHei" w:hAnsi="Microsoft YaHei" w:eastAsia="Microsoft YaHei"/>
+          <w:sz w:val="20"/>
+        </w:rPr>
+        <w:t>徽记</w:t>
+      </w:r>
+    </w:p>
+    <w:p>
+      <w:r>
+        <w:rPr>
+          <w:rFonts w:ascii="Microsoft YaHei" w:hAnsi="Microsoft YaHei" w:eastAsia="Microsoft YaHei"/>
+          <w:b/>
+          <w:sz w:val="20"/>
+        </w:rPr>
+        <w:t>Oracle：</w:t>
+      </w:r>
+      <w:r>
+        <w:rPr>
+          <w:rFonts w:ascii="Microsoft YaHei" w:hAnsi="Microsoft YaHei" w:eastAsia="Microsoft YaHei"/>
+          <w:sz w:val="20"/>
+        </w:rPr>
+        <w:t>每当你牺牲一个珍宝衍生物时，派出一个青玉魔像。</w:t>
+      </w:r>
+    </w:p>
+    <w:p>
+      <w:pPr>
+        <w:pStyle w:val="Heading1"/>
+      </w:pPr>
+      <w:r>
+        <w:t>133. Emblem — Aya's Burst Treasure</w:t>
+      </w:r>
+    </w:p>
+    <w:p>
+      <w:r>
+        <w:rPr>
+          <w:rFonts w:ascii="Microsoft YaHei" w:hAnsi="Microsoft YaHei" w:eastAsia="Microsoft YaHei"/>
+          <w:b/>
+          <w:sz w:val="20"/>
+        </w:rPr>
+        <w:t>版本：</w:t>
+      </w:r>
+      <w:r>
+        <w:rPr>
+          <w:rFonts w:ascii="Microsoft YaHei" w:hAnsi="Microsoft YaHei" w:eastAsia="Microsoft YaHei"/>
+          <w:sz w:val="20"/>
+        </w:rPr>
+        <w:t>TOKEN_HS / 6</w:t>
+      </w:r>
+    </w:p>
+    <w:p>
+      <w:r>
+        <w:rPr>
+          <w:rFonts w:ascii="Microsoft YaHei" w:hAnsi="Microsoft YaHei" w:eastAsia="Microsoft YaHei"/>
+          <w:b/>
+          <w:sz w:val="20"/>
+        </w:rPr>
+        <w:t>类别：</w:t>
+      </w:r>
+      <w:r>
+        <w:rPr>
+          <w:rFonts w:ascii="Microsoft YaHei" w:hAnsi="Microsoft YaHei" w:eastAsia="Microsoft YaHei"/>
+          <w:sz w:val="20"/>
+        </w:rPr>
+        <w:t>徽记</w:t>
+      </w:r>
+    </w:p>
+    <w:p>
+      <w:r>
+        <w:rPr>
+          <w:rFonts w:ascii="Microsoft YaHei" w:hAnsi="Microsoft YaHei" w:eastAsia="Microsoft YaHei"/>
+          <w:b/>
+          <w:sz w:val="20"/>
+        </w:rPr>
+        <w:t>Oracle：</w:t>
+      </w:r>
+      <w:r>
+        <w:rPr>
+          <w:rFonts w:ascii="Microsoft YaHei" w:hAnsi="Microsoft YaHei" w:eastAsia="Microsoft YaHei"/>
+          <w:sz w:val="20"/>
+        </w:rPr>
+        <w:t>每当你牺牲一个珍宝衍生物时，此徽记对一个随机选择的目标造成2点伤害，该目标须既不是你，也不是由你操控的永久物。</w:t>
+      </w:r>
+    </w:p>
+    <w:p>
+      <w:pPr>
+        <w:pStyle w:val="Heading1"/>
+      </w:pPr>
+      <w:r>
+        <w:t>134. Emblem — Aya's Cunning Treasure</w:t>
       </w:r>
     </w:p>
     <w:p>

</xml_diff>